<commit_message>
Reformat dormitory contract with improved layout and styling
https://claude.ai/code/session_01F9bKJvejkADZJgJykeQA49
</commit_message>
<xml_diff>
--- a/社員寮入居契約書.docx
+++ b/社員寮入居契約書.docx
@@ -4,40 +4,1414 @@
   <w:body>
     <w:p>
       <w:pPr>
+        <w:spacing w:before="0" w:after="120"/>
         <w:jc w:val="center"/>
       </w:pPr>
       <w:r>
         <w:rPr>
-          <w:rFonts w:eastAsia="MS明朝"/>
-          <w:rFonts w:ascii="MS明朝" w:hAnsi="MS明朝"/>
+          <w:rFonts w:ascii="MS Mincho" w:hAnsi="MS Mincho" w:eastAsia="MS Mincho"/>
           <w:b/>
-          <w:sz w:val="32"/>
+          <w:sz w:val="36"/>
+          <w:u w:val="none"/>
         </w:rPr>
-        <w:t>社員寮入居契約書</w:t>
+        <w:t>社　員　寮　入　居　契　約　書</w:t>
+      </w:r>
+    </w:p>
+    <w:p>
+      <w:pPr>
+        <w:spacing w:before="0" w:after="40"/>
+        <w:jc w:val="right"/>
+      </w:pPr>
+      <w:r>
+        <w:rPr>
+          <w:rFonts w:ascii="MS Mincho" w:hAnsi="MS Mincho" w:eastAsia="MS Mincho"/>
+          <w:b w:val="0"/>
+          <w:sz w:val="18"/>
+          <w:u w:val="none"/>
+        </w:rPr>
+        <w:t xml:space="preserve">契約番号：　　　　　　　　</w:t>
+      </w:r>
+    </w:p>
+    <w:p>
+      <w:pPr>
+        <w:spacing w:before="0" w:after="160"/>
+      </w:pPr>
+      <w:r>
+        <w:rPr>
+          <w:sz w:val="20"/>
+        </w:rPr>
+        <w:t>──────────────────────────────────────────</w:t>
+      </w:r>
+    </w:p>
+    <w:p>
+      <w:pPr>
+        <w:spacing w:before="0" w:after="200" w:line="360" w:lineRule="exact"/>
+      </w:pPr>
+      <w:r>
+        <w:rPr>
+          <w:rFonts w:ascii="MS Mincho" w:hAnsi="MS Mincho" w:eastAsia="MS Mincho"/>
+          <w:b w:val="0"/>
+          <w:sz w:val="21"/>
+          <w:u w:val="none"/>
+        </w:rPr>
+        <w:t xml:space="preserve">　株式会社○○○○（以下「甲」という。）と下記入居者（以下「乙」という。）とは、甲が賃借する社員寮への入居について、以下のとおり契約を締結する。</w:t>
+      </w:r>
+    </w:p>
+    <w:p>
+      <w:pPr>
+        <w:spacing w:before="80" w:after="80"/>
+        <w:jc w:val="center"/>
+      </w:pPr>
+      <w:r>
+        <w:rPr>
+          <w:rFonts w:ascii="MS Mincho" w:hAnsi="MS Mincho" w:eastAsia="MS Mincho"/>
+          <w:b/>
+          <w:sz w:val="22"/>
+          <w:u w:val="none"/>
+        </w:rPr>
+        <w:t>【 寮 物 件 の 表 示 】</w:t>
+      </w:r>
+    </w:p>
+    <w:tbl>
+      <w:tblPr>
+        <w:tblStyle w:val="TableGrid"/>
+        <w:tblW w:type="auto" w:w="0"/>
+        <w:jc w:val="center"/>
+        <w:tblLook w:firstColumn="1" w:firstRow="1" w:lastColumn="0" w:lastRow="0" w:noHBand="0" w:noVBand="1" w:val="04A0"/>
+      </w:tblPr>
+      <w:tblGrid>
+        <w:gridCol w:w="4252"/>
+        <w:gridCol w:w="4252"/>
+      </w:tblGrid>
+      <w:tr>
+        <w:tc>
+          <w:tcPr>
+            <w:tcW w:type="dxa" w:w="3118"/>
+          </w:tcPr>
+          <w:p>
+            <w:pPr>
+              <w:spacing w:before="40" w:after="40"/>
+              <w:ind w:left="113"/>
+            </w:pPr>
+            <w:r>
+              <w:rPr>
+                <w:rFonts w:ascii="MS Mincho" w:hAnsi="MS Mincho" w:eastAsia="MS Mincho"/>
+                <w:b w:val="0"/>
+                <w:sz w:val="20"/>
+                <w:u w:val="none"/>
+              </w:rPr>
+              <w:t>物　件　所　在　地</w:t>
+            </w:r>
+          </w:p>
+        </w:tc>
+        <w:tc>
+          <w:tcPr>
+            <w:tcW w:type="dxa" w:w="5386"/>
+          </w:tcPr>
+          <w:p>
+            <w:pPr>
+              <w:spacing w:before="40" w:after="40"/>
+              <w:ind w:left="113"/>
+            </w:pPr>
+            <w:r>
+              <w:rPr>
+                <w:rFonts w:ascii="MS Mincho" w:hAnsi="MS Mincho" w:eastAsia="MS Mincho"/>
+                <w:b w:val="0"/>
+                <w:sz w:val="20"/>
+                <w:u w:val="none"/>
+              </w:rPr>
+            </w:r>
+          </w:p>
+        </w:tc>
+      </w:tr>
+      <w:tr>
+        <w:tc>
+          <w:tcPr>
+            <w:tcW w:type="dxa" w:w="3118"/>
+          </w:tcPr>
+          <w:p>
+            <w:pPr>
+              <w:spacing w:before="40" w:after="40"/>
+              <w:ind w:left="113"/>
+            </w:pPr>
+            <w:r>
+              <w:rPr>
+                <w:rFonts w:ascii="MS Mincho" w:hAnsi="MS Mincho" w:eastAsia="MS Mincho"/>
+                <w:b w:val="0"/>
+                <w:sz w:val="20"/>
+                <w:u w:val="none"/>
+              </w:rPr>
+              <w:t>部　屋　番　号</w:t>
+            </w:r>
+          </w:p>
+        </w:tc>
+        <w:tc>
+          <w:tcPr>
+            <w:tcW w:type="dxa" w:w="5386"/>
+          </w:tcPr>
+          <w:p>
+            <w:pPr>
+              <w:spacing w:before="40" w:after="40"/>
+              <w:ind w:left="113"/>
+            </w:pPr>
+            <w:r>
+              <w:rPr>
+                <w:rFonts w:ascii="MS Mincho" w:hAnsi="MS Mincho" w:eastAsia="MS Mincho"/>
+                <w:b w:val="0"/>
+                <w:sz w:val="20"/>
+                <w:u w:val="none"/>
+              </w:rPr>
+              <w:t xml:space="preserve">　　　　号室</w:t>
+            </w:r>
+          </w:p>
+        </w:tc>
+      </w:tr>
+      <w:tr>
+        <w:tc>
+          <w:tcPr>
+            <w:tcW w:type="dxa" w:w="3118"/>
+          </w:tcPr>
+          <w:p>
+            <w:pPr>
+              <w:spacing w:before="40" w:after="40"/>
+              <w:ind w:left="113"/>
+            </w:pPr>
+            <w:r>
+              <w:rPr>
+                <w:rFonts w:ascii="MS Mincho" w:hAnsi="MS Mincho" w:eastAsia="MS Mincho"/>
+                <w:b w:val="0"/>
+                <w:sz w:val="20"/>
+                <w:u w:val="none"/>
+              </w:rPr>
+              <w:t>間　　取　　り</w:t>
+            </w:r>
+          </w:p>
+        </w:tc>
+        <w:tc>
+          <w:tcPr>
+            <w:tcW w:type="dxa" w:w="5386"/>
+          </w:tcPr>
+          <w:p>
+            <w:pPr>
+              <w:spacing w:before="40" w:after="40"/>
+              <w:ind w:left="113"/>
+            </w:pPr>
+            <w:r>
+              <w:rPr>
+                <w:rFonts w:ascii="MS Mincho" w:hAnsi="MS Mincho" w:eastAsia="MS Mincho"/>
+                <w:b w:val="0"/>
+                <w:sz w:val="20"/>
+                <w:u w:val="none"/>
+              </w:rPr>
+            </w:r>
+          </w:p>
+        </w:tc>
+      </w:tr>
+      <w:tr>
+        <w:tc>
+          <w:tcPr>
+            <w:tcW w:type="dxa" w:w="3118"/>
+          </w:tcPr>
+          <w:p>
+            <w:pPr>
+              <w:spacing w:before="40" w:after="40"/>
+              <w:ind w:left="113"/>
+            </w:pPr>
+            <w:r>
+              <w:rPr>
+                <w:rFonts w:ascii="MS Mincho" w:hAnsi="MS Mincho" w:eastAsia="MS Mincho"/>
+                <w:b w:val="0"/>
+                <w:sz w:val="20"/>
+                <w:u w:val="none"/>
+              </w:rPr>
+              <w:t>専　有　面　積</w:t>
+            </w:r>
+          </w:p>
+        </w:tc>
+        <w:tc>
+          <w:tcPr>
+            <w:tcW w:type="dxa" w:w="5386"/>
+          </w:tcPr>
+          <w:p>
+            <w:pPr>
+              <w:spacing w:before="40" w:after="40"/>
+              <w:ind w:left="113"/>
+            </w:pPr>
+            <w:r>
+              <w:rPr>
+                <w:rFonts w:ascii="MS Mincho" w:hAnsi="MS Mincho" w:eastAsia="MS Mincho"/>
+                <w:b w:val="0"/>
+                <w:sz w:val="20"/>
+                <w:u w:val="none"/>
+              </w:rPr>
+              <w:t xml:space="preserve">　　　　　㎡</w:t>
+            </w:r>
+          </w:p>
+        </w:tc>
+      </w:tr>
+      <w:tr>
+        <w:tc>
+          <w:tcPr>
+            <w:tcW w:type="dxa" w:w="3118"/>
+          </w:tcPr>
+          <w:p>
+            <w:pPr>
+              <w:spacing w:before="40" w:after="40"/>
+              <w:ind w:left="113"/>
+            </w:pPr>
+            <w:r>
+              <w:rPr>
+                <w:rFonts w:ascii="MS Mincho" w:hAnsi="MS Mincho" w:eastAsia="MS Mincho"/>
+                <w:b w:val="0"/>
+                <w:sz w:val="20"/>
+                <w:u w:val="none"/>
+              </w:rPr>
+              <w:t>賃　貸　人　名</w:t>
+            </w:r>
+          </w:p>
+        </w:tc>
+        <w:tc>
+          <w:tcPr>
+            <w:tcW w:type="dxa" w:w="5386"/>
+          </w:tcPr>
+          <w:p>
+            <w:pPr>
+              <w:spacing w:before="40" w:after="40"/>
+              <w:ind w:left="113"/>
+            </w:pPr>
+            <w:r>
+              <w:rPr>
+                <w:rFonts w:ascii="MS Mincho" w:hAnsi="MS Mincho" w:eastAsia="MS Mincho"/>
+                <w:b w:val="0"/>
+                <w:sz w:val="20"/>
+                <w:u w:val="none"/>
+              </w:rPr>
+              <w:t>（物件オーナー）</w:t>
+            </w:r>
+          </w:p>
+        </w:tc>
+      </w:tr>
+      <w:tr>
+        <w:tc>
+          <w:tcPr>
+            <w:tcW w:type="dxa" w:w="3118"/>
+          </w:tcPr>
+          <w:p>
+            <w:pPr>
+              <w:spacing w:before="40" w:after="40"/>
+              <w:ind w:left="113"/>
+            </w:pPr>
+            <w:r>
+              <w:rPr>
+                <w:rFonts w:ascii="MS Mincho" w:hAnsi="MS Mincho" w:eastAsia="MS Mincho"/>
+                <w:b w:val="0"/>
+                <w:sz w:val="20"/>
+                <w:u w:val="none"/>
+              </w:rPr>
+              <w:t>甲の支払う月額賃料</w:t>
+            </w:r>
+          </w:p>
+        </w:tc>
+        <w:tc>
+          <w:tcPr>
+            <w:tcW w:type="dxa" w:w="5386"/>
+          </w:tcPr>
+          <w:p>
+            <w:pPr>
+              <w:spacing w:before="40" w:after="40"/>
+              <w:ind w:left="113"/>
+            </w:pPr>
+            <w:r>
+              <w:rPr>
+                <w:rFonts w:ascii="MS Mincho" w:hAnsi="MS Mincho" w:eastAsia="MS Mincho"/>
+                <w:b w:val="0"/>
+                <w:sz w:val="20"/>
+                <w:u w:val="none"/>
+              </w:rPr>
+              <w:t>金　　　　　　　　　円（税込）</w:t>
+            </w:r>
+          </w:p>
+        </w:tc>
+      </w:tr>
+      <w:tr>
+        <w:tc>
+          <w:tcPr>
+            <w:tcW w:type="dxa" w:w="3118"/>
+          </w:tcPr>
+          <w:p>
+            <w:pPr>
+              <w:spacing w:before="40" w:after="40"/>
+              <w:ind w:left="113"/>
+            </w:pPr>
+            <w:r>
+              <w:rPr>
+                <w:rFonts w:ascii="MS Mincho" w:hAnsi="MS Mincho" w:eastAsia="MS Mincho"/>
+                <w:b w:val="0"/>
+                <w:sz w:val="20"/>
+                <w:u w:val="none"/>
+              </w:rPr>
+              <w:t>入　居　開　始　日</w:t>
+            </w:r>
+          </w:p>
+        </w:tc>
+        <w:tc>
+          <w:tcPr>
+            <w:tcW w:type="dxa" w:w="5386"/>
+          </w:tcPr>
+          <w:p>
+            <w:pPr>
+              <w:spacing w:before="40" w:after="40"/>
+              <w:ind w:left="113"/>
+            </w:pPr>
+            <w:r>
+              <w:rPr>
+                <w:rFonts w:ascii="MS Mincho" w:hAnsi="MS Mincho" w:eastAsia="MS Mincho"/>
+                <w:b w:val="0"/>
+                <w:sz w:val="20"/>
+                <w:u w:val="none"/>
+              </w:rPr>
+              <w:t xml:space="preserve">　　　　年　　月　　日</w:t>
+            </w:r>
+          </w:p>
+        </w:tc>
+      </w:tr>
+    </w:tbl>
+    <w:p/>
+    <w:p>
+      <w:pPr>
+        <w:spacing w:before="120" w:after="40"/>
+      </w:pPr>
+      <w:r>
+        <w:rPr>
+          <w:rFonts w:ascii="MS Mincho" w:hAnsi="MS Mincho" w:eastAsia="MS Mincho"/>
+          <w:b/>
+          <w:sz w:val="21"/>
+          <w:u w:val="none"/>
+        </w:rPr>
+        <w:t>第１条　（目　的）</w:t>
+      </w:r>
+    </w:p>
+    <w:p>
+      <w:pPr>
+        <w:spacing w:before="0" w:after="20" w:line="340" w:lineRule="exact"/>
+        <w:ind w:left="397"/>
+      </w:pPr>
+      <w:r>
+        <w:rPr>
+          <w:rFonts w:ascii="MS Mincho" w:hAnsi="MS Mincho" w:eastAsia="MS Mincho"/>
+          <w:b w:val="0"/>
+          <w:sz w:val="21"/>
+          <w:u w:val="none"/>
+        </w:rPr>
+        <w:t>甲は乙に対し、甲が賃借する前掲物件の一室を社員寮として提供し、乙は本契約の定めに従いこれを使用する。</w:t>
+      </w:r>
+    </w:p>
+    <w:p>
+      <w:pPr>
+        <w:spacing w:before="0" w:after="20" w:line="340" w:lineRule="exact"/>
+        <w:ind w:left="397"/>
+      </w:pPr>
+      <w:r>
+        <w:rPr>
+          <w:rFonts w:ascii="MS Mincho" w:hAnsi="MS Mincho" w:eastAsia="MS Mincho"/>
+          <w:b w:val="0"/>
+          <w:sz w:val="21"/>
+          <w:u w:val="none"/>
+        </w:rPr>
+        <w:t>乙は、寮を専ら居住の用に供するものとし、他の目的への転用を禁止する。</w:t>
+      </w:r>
+    </w:p>
+    <w:p>
+      <w:pPr>
+        <w:spacing w:before="120" w:after="40"/>
+      </w:pPr>
+      <w:r>
+        <w:rPr>
+          <w:rFonts w:ascii="MS Mincho" w:hAnsi="MS Mincho" w:eastAsia="MS Mincho"/>
+          <w:b/>
+          <w:sz w:val="21"/>
+          <w:u w:val="none"/>
+        </w:rPr>
+        <w:t>第２条　（契 約 期 間）</w:t>
+      </w:r>
+    </w:p>
+    <w:p>
+      <w:pPr>
+        <w:spacing w:before="0" w:after="20" w:line="340" w:lineRule="exact"/>
+        <w:ind w:left="397"/>
+      </w:pPr>
+      <w:r>
+        <w:rPr>
+          <w:rFonts w:ascii="MS Mincho" w:hAnsi="MS Mincho" w:eastAsia="MS Mincho"/>
+          <w:b w:val="0"/>
+          <w:sz w:val="21"/>
+          <w:u w:val="none"/>
+        </w:rPr>
+        <w:t>本契約の期間は、入居日から　　　年　　月　　日までとする。</w:t>
+      </w:r>
+    </w:p>
+    <w:p>
+      <w:pPr>
+        <w:spacing w:before="0" w:after="20" w:line="340" w:lineRule="exact"/>
+        <w:ind w:left="397"/>
+      </w:pPr>
+      <w:r>
+        <w:rPr>
+          <w:rFonts w:ascii="MS Mincho" w:hAnsi="MS Mincho" w:eastAsia="MS Mincho"/>
+          <w:b w:val="0"/>
+          <w:sz w:val="21"/>
+          <w:u w:val="none"/>
+        </w:rPr>
+        <w:t>乙が在職中である限り、同一条件にて自動更新するものとする。</w:t>
+      </w:r>
+    </w:p>
+    <w:p>
+      <w:pPr>
+        <w:spacing w:before="0" w:after="20" w:line="340" w:lineRule="exact"/>
+        <w:ind w:left="397"/>
+      </w:pPr>
+      <w:r>
+        <w:rPr>
+          <w:rFonts w:ascii="MS Mincho" w:hAnsi="MS Mincho" w:eastAsia="MS Mincho"/>
+          <w:b w:val="0"/>
+          <w:sz w:val="21"/>
+          <w:u w:val="none"/>
+        </w:rPr>
+        <w:t>更新を希望しない場合は、期間満了の60日前までに書面にて通知するものとする。</w:t>
+      </w:r>
+    </w:p>
+    <w:p>
+      <w:pPr>
+        <w:spacing w:before="0" w:after="20" w:line="340" w:lineRule="exact"/>
+        <w:ind w:left="397"/>
+      </w:pPr>
+      <w:r>
+        <w:rPr>
+          <w:rFonts w:ascii="MS Mincho" w:hAnsi="MS Mincho" w:eastAsia="MS Mincho"/>
+          <w:b w:val="0"/>
+          <w:sz w:val="21"/>
+          <w:u w:val="none"/>
+        </w:rPr>
+        <w:t>乙が退職（自己都合・会社都合を問わない）した場合、退職日の翌日から起算して30日以内に退去するものとする。</w:t>
+      </w:r>
+    </w:p>
+    <w:p>
+      <w:pPr>
+        <w:spacing w:before="120" w:after="40"/>
+      </w:pPr>
+      <w:r>
+        <w:rPr>
+          <w:rFonts w:ascii="MS Mincho" w:hAnsi="MS Mincho" w:eastAsia="MS Mincho"/>
+          <w:b/>
+          <w:sz w:val="21"/>
+          <w:u w:val="none"/>
+        </w:rPr>
+        <w:t>第３条　（雇 用 と の 連 動）</w:t>
+      </w:r>
+    </w:p>
+    <w:p>
+      <w:pPr>
+        <w:spacing w:before="0" w:after="20" w:line="340" w:lineRule="exact"/>
+        <w:ind w:left="397"/>
+      </w:pPr>
+      <w:r>
+        <w:rPr>
+          <w:rFonts w:ascii="MS Mincho" w:hAnsi="MS Mincho" w:eastAsia="MS Mincho"/>
+          <w:b w:val="0"/>
+          <w:sz w:val="21"/>
+          <w:u w:val="none"/>
+        </w:rPr>
+        <w:t>本契約は、乙が甲の従業員であることを前提とする。</w:t>
+      </w:r>
+    </w:p>
+    <w:p>
+      <w:pPr>
+        <w:spacing w:before="0" w:after="20" w:line="340" w:lineRule="exact"/>
+        <w:ind w:left="397"/>
+      </w:pPr>
+      <w:r>
+        <w:rPr>
+          <w:rFonts w:ascii="MS Mincho" w:hAnsi="MS Mincho" w:eastAsia="MS Mincho"/>
+          <w:b w:val="0"/>
+          <w:sz w:val="21"/>
+          <w:u w:val="none"/>
+        </w:rPr>
+        <w:t>乙が雇用契約を終了した場合（退職・解雇・雇止めを含む）、本契約は当然に終了する。</w:t>
+      </w:r>
+    </w:p>
+    <w:p>
+      <w:pPr>
+        <w:spacing w:before="120" w:after="40"/>
+      </w:pPr>
+      <w:r>
+        <w:rPr>
+          <w:rFonts w:ascii="MS Mincho" w:hAnsi="MS Mincho" w:eastAsia="MS Mincho"/>
+          <w:b/>
+          <w:sz w:val="21"/>
+          <w:u w:val="none"/>
+        </w:rPr>
+        <w:t>第４条　（寮 費・支 払 方 法）</w:t>
+      </w:r>
+    </w:p>
+    <w:p>
+      <w:pPr>
+        <w:spacing w:before="0" w:after="20" w:line="340" w:lineRule="exact"/>
+        <w:ind w:left="397"/>
+      </w:pPr>
+      <w:r>
+        <w:rPr>
+          <w:rFonts w:ascii="MS Mincho" w:hAnsi="MS Mincho" w:eastAsia="MS Mincho"/>
+          <w:b w:val="0"/>
+          <w:sz w:val="21"/>
+          <w:u w:val="none"/>
+        </w:rPr>
+        <w:t>乙は甲に対し、毎月以下の寮費を支払うものとする。</w:t>
+      </w:r>
+    </w:p>
+    <w:p>
+      <w:pPr>
+        <w:spacing w:before="0" w:after="20" w:line="340" w:lineRule="exact"/>
+        <w:ind w:left="397"/>
+      </w:pPr>
+      <w:r>
+        <w:rPr>
+          <w:rFonts w:ascii="MS Mincho" w:hAnsi="MS Mincho" w:eastAsia="MS Mincho"/>
+          <w:b w:val="0"/>
+          <w:sz w:val="21"/>
+          <w:u w:val="none"/>
+        </w:rPr>
+        <w:t xml:space="preserve">　　月額寮費：金　　　　　　　円（甲の月額賃料 ＋ 10,000円）</w:t>
+      </w:r>
+    </w:p>
+    <w:p>
+      <w:pPr>
+        <w:spacing w:before="0" w:after="20" w:line="340" w:lineRule="exact"/>
+        <w:ind w:left="397"/>
+      </w:pPr>
+      <w:r>
+        <w:rPr>
+          <w:rFonts w:ascii="MS Mincho" w:hAnsi="MS Mincho" w:eastAsia="MS Mincho"/>
+          <w:b w:val="0"/>
+          <w:sz w:val="21"/>
+          <w:u w:val="none"/>
+        </w:rPr>
+        <w:t xml:space="preserve">　　支払期日：毎月　　日までに翌月分</w:t>
+      </w:r>
+    </w:p>
+    <w:p>
+      <w:pPr>
+        <w:spacing w:before="0" w:after="20" w:line="340" w:lineRule="exact"/>
+        <w:ind w:left="397"/>
+      </w:pPr>
+      <w:r>
+        <w:rPr>
+          <w:rFonts w:ascii="MS Mincho" w:hAnsi="MS Mincho" w:eastAsia="MS Mincho"/>
+          <w:b w:val="0"/>
+          <w:sz w:val="21"/>
+          <w:u w:val="none"/>
+        </w:rPr>
+        <w:t xml:space="preserve">　　支払方法：甲指定口座への振込、または給与からの控除（乙の書面同意による）</w:t>
+      </w:r>
+    </w:p>
+    <w:p>
+      <w:pPr>
+        <w:spacing w:before="0" w:after="20" w:line="340" w:lineRule="exact"/>
+        <w:ind w:left="397"/>
+      </w:pPr>
+      <w:r>
+        <w:rPr>
+          <w:rFonts w:ascii="MS Mincho" w:hAnsi="MS Mincho" w:eastAsia="MS Mincho"/>
+          <w:b w:val="0"/>
+          <w:sz w:val="21"/>
+          <w:u w:val="none"/>
+        </w:rPr>
+        <w:t>寮費の改定が必要な場合、甲は1ヶ月前に書面で通知する。</w:t>
+      </w:r>
+    </w:p>
+    <w:p>
+      <w:pPr>
+        <w:spacing w:before="120" w:after="40"/>
+      </w:pPr>
+      <w:r>
+        <w:rPr>
+          <w:rFonts w:ascii="MS Mincho" w:hAnsi="MS Mincho" w:eastAsia="MS Mincho"/>
+          <w:b/>
+          <w:sz w:val="21"/>
+          <w:u w:val="none"/>
+        </w:rPr>
+        <w:t>第５条　（初 期 費 用 の 取 扱 い）</w:t>
+      </w:r>
+    </w:p>
+    <w:p>
+      <w:pPr>
+        <w:spacing w:before="0" w:after="20" w:line="340" w:lineRule="exact"/>
+        <w:ind w:left="397"/>
+      </w:pPr>
+      <w:r>
+        <w:rPr>
+          <w:rFonts w:ascii="MS Mincho" w:hAnsi="MS Mincho" w:eastAsia="MS Mincho"/>
+          <w:b w:val="0"/>
+          <w:sz w:val="21"/>
+          <w:u w:val="none"/>
+        </w:rPr>
+        <w:t>甲は、賃貸借契約に基づき次の初期費用を立替負担する。</w:t>
+      </w:r>
+    </w:p>
+    <w:p>
+      <w:pPr>
+        <w:spacing w:before="0" w:after="20" w:line="340" w:lineRule="exact"/>
+        <w:ind w:left="397"/>
+      </w:pPr>
+      <w:r>
+        <w:rPr>
+          <w:rFonts w:ascii="MS Mincho" w:hAnsi="MS Mincho" w:eastAsia="MS Mincho"/>
+          <w:b w:val="0"/>
+          <w:sz w:val="21"/>
+          <w:u w:val="none"/>
+        </w:rPr>
+        <w:t xml:space="preserve">　　敷　金：金　　　　　　　円</w:t>
+      </w:r>
+    </w:p>
+    <w:p>
+      <w:pPr>
+        <w:spacing w:before="0" w:after="20" w:line="340" w:lineRule="exact"/>
+        <w:ind w:left="397"/>
+      </w:pPr>
+      <w:r>
+        <w:rPr>
+          <w:rFonts w:ascii="MS Mincho" w:hAnsi="MS Mincho" w:eastAsia="MS Mincho"/>
+          <w:b w:val="0"/>
+          <w:sz w:val="21"/>
+          <w:u w:val="none"/>
+        </w:rPr>
+        <w:t xml:space="preserve">　　礼　金：金　　　　　　　円</w:t>
+      </w:r>
+    </w:p>
+    <w:p>
+      <w:pPr>
+        <w:spacing w:before="0" w:after="20" w:line="340" w:lineRule="exact"/>
+        <w:ind w:left="397"/>
+      </w:pPr>
+      <w:r>
+        <w:rPr>
+          <w:rFonts w:ascii="MS Mincho" w:hAnsi="MS Mincho" w:eastAsia="MS Mincho"/>
+          <w:b w:val="0"/>
+          <w:sz w:val="21"/>
+          <w:u w:val="none"/>
+        </w:rPr>
+        <w:t xml:space="preserve">　　仲介手数料等：金　　　　　　　円</w:t>
+      </w:r>
+    </w:p>
+    <w:p>
+      <w:pPr>
+        <w:spacing w:before="0" w:after="20" w:line="340" w:lineRule="exact"/>
+        <w:ind w:left="397"/>
+      </w:pPr>
+      <w:r>
+        <w:rPr>
+          <w:rFonts w:ascii="MS Mincho" w:hAnsi="MS Mincho" w:eastAsia="MS Mincho"/>
+          <w:b w:val="0"/>
+          <w:sz w:val="21"/>
+          <w:u w:val="none"/>
+        </w:rPr>
+        <w:t xml:space="preserve">　　合　計：金　　　　　　　円（以下「初期費用総額」という。）</w:t>
+      </w:r>
+    </w:p>
+    <w:p>
+      <w:pPr>
+        <w:spacing w:before="0" w:after="20" w:line="340" w:lineRule="exact"/>
+        <w:ind w:left="397"/>
+      </w:pPr>
+      <w:r>
+        <w:rPr>
+          <w:rFonts w:ascii="MS Mincho" w:hAnsi="MS Mincho" w:eastAsia="MS Mincho"/>
+          <w:b w:val="0"/>
+          <w:sz w:val="21"/>
+          <w:u w:val="none"/>
+        </w:rPr>
+        <w:t>敷金は退去時に物件から返還される場合、甲に帰属する。乙の故意・過失による損傷に起因する原状回復費用は乙が負担する。</w:t>
+      </w:r>
+    </w:p>
+    <w:p>
+      <w:pPr>
+        <w:spacing w:before="120" w:after="40"/>
+      </w:pPr>
+      <w:r>
+        <w:rPr>
+          <w:rFonts w:ascii="MS Mincho" w:hAnsi="MS Mincho" w:eastAsia="MS Mincho"/>
+          <w:b/>
+          <w:sz w:val="21"/>
+          <w:u w:val="none"/>
+        </w:rPr>
+        <w:t>第６条　（初期費用分担金・早期退去時の精算）</w:t>
+      </w:r>
+    </w:p>
+    <w:p>
+      <w:pPr>
+        <w:spacing w:before="0" w:after="20" w:line="340" w:lineRule="exact"/>
+        <w:ind w:left="397"/>
+      </w:pPr>
+      <w:r>
+        <w:rPr>
+          <w:rFonts w:ascii="MS Mincho" w:hAnsi="MS Mincho" w:eastAsia="MS Mincho"/>
+          <w:b w:val="0"/>
+          <w:sz w:val="21"/>
+          <w:u w:val="none"/>
+        </w:rPr>
+        <w:t>乙は、甲が負担した初期費用の分担として、月額寮費に含まれる10,000円を在籍期間中継続して支払うものとする。</w:t>
+      </w:r>
+    </w:p>
+    <w:p>
+      <w:pPr>
+        <w:spacing w:before="0" w:after="20" w:line="340" w:lineRule="exact"/>
+        <w:ind w:left="397"/>
+      </w:pPr>
+      <w:r>
+        <w:rPr>
+          <w:rFonts w:ascii="MS Mincho" w:hAnsi="MS Mincho" w:eastAsia="MS Mincho"/>
+          <w:b w:val="0"/>
+          <w:sz w:val="21"/>
+          <w:u w:val="none"/>
+        </w:rPr>
+        <w:t>乙が入居日から　　　ヶ月以内に退去した場合、乙は甲に対し下記算式による未回収初期費用相当額を一括返還するものとする。</w:t>
       </w:r>
     </w:p>
     <w:p/>
     <w:p>
+      <w:pPr>
+        <w:spacing w:before="0" w:after="20" w:line="340" w:lineRule="exact"/>
+        <w:ind w:left="397"/>
+      </w:pPr>
       <w:r>
         <w:rPr>
-          <w:rFonts w:eastAsia="MS明朝"/>
-          <w:rFonts w:ascii="MS明朝" w:hAnsi="MS明朝"/>
+          <w:rFonts w:ascii="MS Mincho" w:hAnsi="MS Mincho" w:eastAsia="MS Mincho"/>
           <w:b w:val="0"/>
           <w:sz w:val="21"/>
+          <w:u w:val="none"/>
         </w:rPr>
-        <w:t xml:space="preserve">　　株式会社○○○○（以下「甲」という。）と入居者　　　　　　　　（以下「乙」という。）とは、甲が賃借する社員寮（以下「寮」という。）の入居について、以下のとおり契約を締結する。</w:t>
+        <w:t xml:space="preserve">　　　　未回収額 ＝ 初期費用総額 − （実際の在籍月数 × 10,000円）</w:t>
       </w:r>
     </w:p>
     <w:p/>
     <w:p>
+      <w:pPr>
+        <w:spacing w:before="0" w:after="20" w:line="340" w:lineRule="exact"/>
+        <w:ind w:left="397"/>
+      </w:pPr>
       <w:r>
         <w:rPr>
-          <w:rFonts w:eastAsia="MS明朝"/>
-          <w:rFonts w:ascii="MS明朝" w:hAnsi="MS明朝"/>
+          <w:rFonts w:ascii="MS Mincho" w:hAnsi="MS Mincho" w:eastAsia="MS Mincho"/>
+          <w:b w:val="0"/>
+          <w:sz w:val="21"/>
+          <w:u w:val="none"/>
+        </w:rPr>
+        <w:t>前項の返還は、退去確定後　　日以内に行うものとする。</w:t>
+      </w:r>
+    </w:p>
+    <w:p>
+      <w:pPr>
+        <w:spacing w:before="0" w:after="20" w:line="340" w:lineRule="exact"/>
+        <w:ind w:left="397"/>
+      </w:pPr>
+      <w:r>
+        <w:rPr>
+          <w:rFonts w:ascii="MS Mincho" w:hAnsi="MS Mincho" w:eastAsia="MS Mincho"/>
+          <w:b w:val="0"/>
+          <w:sz w:val="21"/>
+          <w:u w:val="none"/>
+        </w:rPr>
+        <w:t>未払いの未回収額がある場合、甲は最終給与・退職金等と相殺することができる。ただし、最低賃金を下回る控除は行わない。</w:t>
+      </w:r>
+    </w:p>
+    <w:p>
+      <w:pPr>
+        <w:spacing w:before="120" w:after="40"/>
+      </w:pPr>
+      <w:r>
+        <w:rPr>
+          <w:rFonts w:ascii="MS Mincho" w:hAnsi="MS Mincho" w:eastAsia="MS Mincho"/>
           <w:b/>
-          <w:sz w:val="22"/>
+          <w:sz w:val="21"/>
+          <w:u w:val="none"/>
         </w:rPr>
-        <w:t>【寮物件の表示】</w:t>
+        <w:t>第７条　（連 帯 保 証 人）</w:t>
+      </w:r>
+    </w:p>
+    <w:p>
+      <w:pPr>
+        <w:spacing w:before="0" w:after="20" w:line="340" w:lineRule="exact"/>
+        <w:ind w:left="397"/>
+      </w:pPr>
+      <w:r>
+        <w:rPr>
+          <w:rFonts w:ascii="MS Mincho" w:hAnsi="MS Mincho" w:eastAsia="MS Mincho"/>
+          <w:b w:val="0"/>
+          <w:sz w:val="21"/>
+          <w:u w:val="none"/>
+        </w:rPr>
+        <w:t>乙は連帯保証人１名を立てるものとする。</w:t>
+      </w:r>
+    </w:p>
+    <w:p>
+      <w:pPr>
+        <w:spacing w:before="0" w:after="20" w:line="340" w:lineRule="exact"/>
+        <w:ind w:left="397"/>
+      </w:pPr>
+      <w:r>
+        <w:rPr>
+          <w:rFonts w:ascii="MS Mincho" w:hAnsi="MS Mincho" w:eastAsia="MS Mincho"/>
+          <w:b w:val="0"/>
+          <w:sz w:val="21"/>
+          <w:u w:val="none"/>
+        </w:rPr>
+        <w:t>連帯保証人は乙と連帯して本契約から生じる一切の債務を負う。</w:t>
+      </w:r>
+    </w:p>
+    <w:p>
+      <w:pPr>
+        <w:spacing w:before="120" w:after="40"/>
+      </w:pPr>
+      <w:r>
+        <w:rPr>
+          <w:rFonts w:ascii="MS Mincho" w:hAnsi="MS Mincho" w:eastAsia="MS Mincho"/>
+          <w:b/>
+          <w:sz w:val="21"/>
+          <w:u w:val="none"/>
+        </w:rPr>
+        <w:t>第８条　（施 設 の 使 用・管 理）</w:t>
+      </w:r>
+    </w:p>
+    <w:p>
+      <w:pPr>
+        <w:spacing w:before="0" w:after="20" w:line="340" w:lineRule="exact"/>
+        <w:ind w:left="397"/>
+      </w:pPr>
+      <w:r>
+        <w:rPr>
+          <w:rFonts w:ascii="MS Mincho" w:hAnsi="MS Mincho" w:eastAsia="MS Mincho"/>
+          <w:b w:val="0"/>
+          <w:sz w:val="21"/>
+          <w:u w:val="none"/>
+        </w:rPr>
+        <w:t>乙は善良なる管理者の注意をもって寮を管理しなければならない。</w:t>
+      </w:r>
+    </w:p>
+    <w:p>
+      <w:pPr>
+        <w:spacing w:before="0" w:after="20" w:line="340" w:lineRule="exact"/>
+        <w:ind w:left="397"/>
+      </w:pPr>
+      <w:r>
+        <w:rPr>
+          <w:rFonts w:ascii="MS Mincho" w:hAnsi="MS Mincho" w:eastAsia="MS Mincho"/>
+          <w:b w:val="0"/>
+          <w:sz w:val="21"/>
+          <w:u w:val="none"/>
+        </w:rPr>
+        <w:t>乙は以下の行為を禁止する。</w:t>
+      </w:r>
+    </w:p>
+    <w:p>
+      <w:pPr>
+        <w:spacing w:before="0" w:after="20" w:line="340" w:lineRule="exact"/>
+        <w:ind w:left="397"/>
+      </w:pPr>
+      <w:r>
+        <w:rPr>
+          <w:rFonts w:ascii="MS Mincho" w:hAnsi="MS Mincho" w:eastAsia="MS Mincho"/>
+          <w:b w:val="0"/>
+          <w:sz w:val="21"/>
+          <w:u w:val="none"/>
+        </w:rPr>
+        <w:t xml:space="preserve">　（1）無断での第三者の宿泊・同居</w:t>
+      </w:r>
+    </w:p>
+    <w:p>
+      <w:pPr>
+        <w:spacing w:before="0" w:after="20" w:line="340" w:lineRule="exact"/>
+        <w:ind w:left="397"/>
+      </w:pPr>
+      <w:r>
+        <w:rPr>
+          <w:rFonts w:ascii="MS Mincho" w:hAnsi="MS Mincho" w:eastAsia="MS Mincho"/>
+          <w:b w:val="0"/>
+          <w:sz w:val="21"/>
+          <w:u w:val="none"/>
+        </w:rPr>
+        <w:t xml:space="preserve">　（2）部屋の改造・設備の無断取替え</w:t>
+      </w:r>
+    </w:p>
+    <w:p>
+      <w:pPr>
+        <w:spacing w:before="0" w:after="20" w:line="340" w:lineRule="exact"/>
+        <w:ind w:left="397"/>
+      </w:pPr>
+      <w:r>
+        <w:rPr>
+          <w:rFonts w:ascii="MS Mincho" w:hAnsi="MS Mincho" w:eastAsia="MS Mincho"/>
+          <w:b w:val="0"/>
+          <w:sz w:val="21"/>
+          <w:u w:val="none"/>
+        </w:rPr>
+        <w:t xml:space="preserve">　（3）危険物・ペットの持込み</w:t>
+      </w:r>
+    </w:p>
+    <w:p>
+      <w:pPr>
+        <w:spacing w:before="0" w:after="20" w:line="340" w:lineRule="exact"/>
+        <w:ind w:left="397"/>
+      </w:pPr>
+      <w:r>
+        <w:rPr>
+          <w:rFonts w:ascii="MS Mincho" w:hAnsi="MS Mincho" w:eastAsia="MS Mincho"/>
+          <w:b w:val="0"/>
+          <w:sz w:val="21"/>
+          <w:u w:val="none"/>
+        </w:rPr>
+        <w:t xml:space="preserve">　（4）近隣への迷惑行為（騒音・悪臭等）</w:t>
+      </w:r>
+    </w:p>
+    <w:p>
+      <w:pPr>
+        <w:spacing w:before="0" w:after="20" w:line="340" w:lineRule="exact"/>
+        <w:ind w:left="397"/>
+      </w:pPr>
+      <w:r>
+        <w:rPr>
+          <w:rFonts w:ascii="MS Mincho" w:hAnsi="MS Mincho" w:eastAsia="MS Mincho"/>
+          <w:b w:val="0"/>
+          <w:sz w:val="21"/>
+          <w:u w:val="none"/>
+        </w:rPr>
+        <w:t xml:space="preserve">　（5）業務・営利目的での使用</w:t>
+      </w:r>
+    </w:p>
+    <w:p>
+      <w:pPr>
+        <w:spacing w:before="0" w:after="20" w:line="340" w:lineRule="exact"/>
+        <w:ind w:left="397"/>
+      </w:pPr>
+      <w:r>
+        <w:rPr>
+          <w:rFonts w:ascii="MS Mincho" w:hAnsi="MS Mincho" w:eastAsia="MS Mincho"/>
+          <w:b w:val="0"/>
+          <w:sz w:val="21"/>
+          <w:u w:val="none"/>
+        </w:rPr>
+        <w:t xml:space="preserve">　（6）その他甲が定める管理規程への違反</w:t>
+      </w:r>
+    </w:p>
+    <w:p>
+      <w:pPr>
+        <w:spacing w:before="120" w:after="40"/>
+      </w:pPr>
+      <w:r>
+        <w:rPr>
+          <w:rFonts w:ascii="MS Mincho" w:hAnsi="MS Mincho" w:eastAsia="MS Mincho"/>
+          <w:b/>
+          <w:sz w:val="21"/>
+          <w:u w:val="none"/>
+        </w:rPr>
+        <w:t>第９条　（退 去・原 状 回 復）</w:t>
+      </w:r>
+    </w:p>
+    <w:p>
+      <w:pPr>
+        <w:spacing w:before="0" w:after="20" w:line="340" w:lineRule="exact"/>
+        <w:ind w:left="397"/>
+      </w:pPr>
+      <w:r>
+        <w:rPr>
+          <w:rFonts w:ascii="MS Mincho" w:hAnsi="MS Mincho" w:eastAsia="MS Mincho"/>
+          <w:b w:val="0"/>
+          <w:sz w:val="21"/>
+          <w:u w:val="none"/>
+        </w:rPr>
+        <w:t>乙は退去の際、善管注意義務違反による損傷箇所を原状回復するものとする。</w:t>
+      </w:r>
+    </w:p>
+    <w:p>
+      <w:pPr>
+        <w:spacing w:before="0" w:after="20" w:line="340" w:lineRule="exact"/>
+        <w:ind w:left="397"/>
+      </w:pPr>
+      <w:r>
+        <w:rPr>
+          <w:rFonts w:ascii="MS Mincho" w:hAnsi="MS Mincho" w:eastAsia="MS Mincho"/>
+          <w:b w:val="0"/>
+          <w:sz w:val="21"/>
+          <w:u w:val="none"/>
+        </w:rPr>
+        <w:t>退去30日前までに書面にて甲へ通知しなければならない。</w:t>
+      </w:r>
+    </w:p>
+    <w:p>
+      <w:pPr>
+        <w:spacing w:before="0" w:after="20" w:line="340" w:lineRule="exact"/>
+        <w:ind w:left="397"/>
+      </w:pPr>
+      <w:r>
+        <w:rPr>
+          <w:rFonts w:ascii="MS Mincho" w:hAnsi="MS Mincho" w:eastAsia="MS Mincho"/>
+          <w:b w:val="0"/>
+          <w:sz w:val="21"/>
+          <w:u w:val="none"/>
+        </w:rPr>
+        <w:t>甲は退去後速やかに室内状況を確認し、乙の負担額を通知する。</w:t>
+      </w:r>
+    </w:p>
+    <w:p>
+      <w:pPr>
+        <w:spacing w:before="120" w:after="40"/>
+      </w:pPr>
+      <w:r>
+        <w:rPr>
+          <w:rFonts w:ascii="MS Mincho" w:hAnsi="MS Mincho" w:eastAsia="MS Mincho"/>
+          <w:b/>
+          <w:sz w:val="21"/>
+          <w:u w:val="none"/>
+        </w:rPr>
+        <w:t>第10条　（支 払 遅 延）</w:t>
+      </w:r>
+    </w:p>
+    <w:p>
+      <w:pPr>
+        <w:spacing w:before="0" w:after="20" w:line="340" w:lineRule="exact"/>
+        <w:ind w:left="397"/>
+      </w:pPr>
+      <w:r>
+        <w:rPr>
+          <w:rFonts w:ascii="MS Mincho" w:hAnsi="MS Mincho" w:eastAsia="MS Mincho"/>
+          <w:b w:val="0"/>
+          <w:sz w:val="21"/>
+          <w:u w:val="none"/>
+        </w:rPr>
+        <w:t>寮費が支払期日を超過した場合、年14.6%の遅延損害金を加算する。</w:t>
+      </w:r>
+    </w:p>
+    <w:p>
+      <w:pPr>
+        <w:spacing w:before="0" w:after="20" w:line="340" w:lineRule="exact"/>
+        <w:ind w:left="397"/>
+      </w:pPr>
+      <w:r>
+        <w:rPr>
+          <w:rFonts w:ascii="MS Mincho" w:hAnsi="MS Mincho" w:eastAsia="MS Mincho"/>
+          <w:b w:val="0"/>
+          <w:sz w:val="21"/>
+          <w:u w:val="none"/>
+        </w:rPr>
+        <w:t>7日以上の遅延が続いた場合、甲は入居を制限できる。</w:t>
+      </w:r>
+    </w:p>
+    <w:p>
+      <w:pPr>
+        <w:spacing w:before="0" w:after="20" w:line="340" w:lineRule="exact"/>
+        <w:ind w:left="397"/>
+      </w:pPr>
+      <w:r>
+        <w:rPr>
+          <w:rFonts w:ascii="MS Mincho" w:hAnsi="MS Mincho" w:eastAsia="MS Mincho"/>
+          <w:b w:val="0"/>
+          <w:sz w:val="21"/>
+          <w:u w:val="none"/>
+        </w:rPr>
+        <w:t>15日以上の遅延が続いた場合、甲は本契約を解除できる。</w:t>
+      </w:r>
+    </w:p>
+    <w:p>
+      <w:pPr>
+        <w:spacing w:before="120" w:after="40"/>
+      </w:pPr>
+      <w:r>
+        <w:rPr>
+          <w:rFonts w:ascii="MS Mincho" w:hAnsi="MS Mincho" w:eastAsia="MS Mincho"/>
+          <w:b/>
+          <w:sz w:val="21"/>
+          <w:u w:val="none"/>
+        </w:rPr>
+        <w:t>第11条　（即 時 解 除）</w:t>
+      </w:r>
+    </w:p>
+    <w:p>
+      <w:pPr>
+        <w:spacing w:before="0" w:after="20" w:line="340" w:lineRule="exact"/>
+        <w:ind w:left="397"/>
+      </w:pPr>
+      <w:r>
+        <w:rPr>
+          <w:rFonts w:ascii="MS Mincho" w:hAnsi="MS Mincho" w:eastAsia="MS Mincho"/>
+          <w:b w:val="0"/>
+          <w:sz w:val="21"/>
+          <w:u w:val="none"/>
+        </w:rPr>
+        <w:t>甲は、乙が以下のいずれかに該当する場合、催告なしに即時解除できる。</w:t>
+      </w:r>
+    </w:p>
+    <w:p>
+      <w:pPr>
+        <w:spacing w:before="0" w:after="20" w:line="340" w:lineRule="exact"/>
+        <w:ind w:left="397"/>
+      </w:pPr>
+      <w:r>
+        <w:rPr>
+          <w:rFonts w:ascii="MS Mincho" w:hAnsi="MS Mincho" w:eastAsia="MS Mincho"/>
+          <w:b w:val="0"/>
+          <w:sz w:val="21"/>
+          <w:u w:val="none"/>
+        </w:rPr>
+        <w:t xml:space="preserve">　（1）寮費の支払いを怠ったとき</w:t>
+      </w:r>
+    </w:p>
+    <w:p>
+      <w:pPr>
+        <w:spacing w:before="0" w:after="20" w:line="340" w:lineRule="exact"/>
+        <w:ind w:left="397"/>
+      </w:pPr>
+      <w:r>
+        <w:rPr>
+          <w:rFonts w:ascii="MS Mincho" w:hAnsi="MS Mincho" w:eastAsia="MS Mincho"/>
+          <w:b w:val="0"/>
+          <w:sz w:val="21"/>
+          <w:u w:val="none"/>
+        </w:rPr>
+        <w:t xml:space="preserve">　（2）虚偽の申告をしたとき</w:t>
+      </w:r>
+    </w:p>
+    <w:p>
+      <w:pPr>
+        <w:spacing w:before="0" w:after="20" w:line="340" w:lineRule="exact"/>
+        <w:ind w:left="397"/>
+      </w:pPr>
+      <w:r>
+        <w:rPr>
+          <w:rFonts w:ascii="MS Mincho" w:hAnsi="MS Mincho" w:eastAsia="MS Mincho"/>
+          <w:b w:val="0"/>
+          <w:sz w:val="21"/>
+          <w:u w:val="none"/>
+        </w:rPr>
+        <w:t xml:space="preserve">　（3）禁止事項に違反したとき</w:t>
+      </w:r>
+    </w:p>
+    <w:p>
+      <w:pPr>
+        <w:spacing w:before="0" w:after="20" w:line="340" w:lineRule="exact"/>
+        <w:ind w:left="397"/>
+      </w:pPr>
+      <w:r>
+        <w:rPr>
+          <w:rFonts w:ascii="MS Mincho" w:hAnsi="MS Mincho" w:eastAsia="MS Mincho"/>
+          <w:b w:val="0"/>
+          <w:sz w:val="21"/>
+          <w:u w:val="none"/>
+        </w:rPr>
+        <w:t xml:space="preserve">　（4）甲を退職したとき</w:t>
+      </w:r>
+    </w:p>
+    <w:p>
+      <w:pPr>
+        <w:spacing w:before="0" w:after="20" w:line="340" w:lineRule="exact"/>
+        <w:ind w:left="397"/>
+      </w:pPr>
+      <w:r>
+        <w:rPr>
+          <w:rFonts w:ascii="MS Mincho" w:hAnsi="MS Mincho" w:eastAsia="MS Mincho"/>
+          <w:b w:val="0"/>
+          <w:sz w:val="21"/>
+          <w:u w:val="none"/>
+        </w:rPr>
+        <w:t xml:space="preserve">　（5）反社会的勢力に関与したとき</w:t>
+      </w:r>
+    </w:p>
+    <w:p>
+      <w:pPr>
+        <w:spacing w:before="0" w:after="20" w:line="340" w:lineRule="exact"/>
+        <w:ind w:left="397"/>
+      </w:pPr>
+      <w:r>
+        <w:rPr>
+          <w:rFonts w:ascii="MS Mincho" w:hAnsi="MS Mincho" w:eastAsia="MS Mincho"/>
+          <w:b w:val="0"/>
+          <w:sz w:val="21"/>
+          <w:u w:val="none"/>
+        </w:rPr>
+        <w:t xml:space="preserve">　（6）その他本契約の重大な違反があったとき</w:t>
+      </w:r>
+    </w:p>
+    <w:p>
+      <w:pPr>
+        <w:spacing w:before="120" w:after="40"/>
+      </w:pPr>
+      <w:r>
+        <w:rPr>
+          <w:rFonts w:ascii="MS Mincho" w:hAnsi="MS Mincho" w:eastAsia="MS Mincho"/>
+          <w:b/>
+          <w:sz w:val="21"/>
+          <w:u w:val="none"/>
+        </w:rPr>
+        <w:t>第12条　（損 害 賠 償）</w:t>
+      </w:r>
+    </w:p>
+    <w:p>
+      <w:pPr>
+        <w:spacing w:before="0" w:after="20" w:line="340" w:lineRule="exact"/>
+        <w:ind w:left="397"/>
+      </w:pPr>
+      <w:r>
+        <w:rPr>
+          <w:rFonts w:ascii="MS Mincho" w:hAnsi="MS Mincho" w:eastAsia="MS Mincho"/>
+          <w:b w:val="0"/>
+          <w:sz w:val="21"/>
+          <w:u w:val="none"/>
+        </w:rPr>
+        <w:t>乙の故意または過失により甲または第三者に損害が生じた場合、乙はその全額を賠償する。</w:t>
+      </w:r>
+    </w:p>
+    <w:p>
+      <w:pPr>
+        <w:spacing w:before="120" w:after="40"/>
+      </w:pPr>
+      <w:r>
+        <w:rPr>
+          <w:rFonts w:ascii="MS Mincho" w:hAnsi="MS Mincho" w:eastAsia="MS Mincho"/>
+          <w:b/>
+          <w:sz w:val="21"/>
+          <w:u w:val="none"/>
+        </w:rPr>
+        <w:t>第13条　（反 社 会 的 勢 力 の 排 除）</w:t>
+      </w:r>
+    </w:p>
+    <w:p>
+      <w:pPr>
+        <w:spacing w:before="0" w:after="20" w:line="340" w:lineRule="exact"/>
+        <w:ind w:left="397"/>
+      </w:pPr>
+      <w:r>
+        <w:rPr>
+          <w:rFonts w:ascii="MS Mincho" w:hAnsi="MS Mincho" w:eastAsia="MS Mincho"/>
+          <w:b w:val="0"/>
+          <w:sz w:val="21"/>
+          <w:u w:val="none"/>
+        </w:rPr>
+        <w:t>乙および連帯保証人は、自らが反社会的勢力でないことを表明・保証する。</w:t>
+      </w:r>
+    </w:p>
+    <w:p>
+      <w:pPr>
+        <w:spacing w:before="0" w:after="20" w:line="340" w:lineRule="exact"/>
+        <w:ind w:left="397"/>
+      </w:pPr>
+      <w:r>
+        <w:rPr>
+          <w:rFonts w:ascii="MS Mincho" w:hAnsi="MS Mincho" w:eastAsia="MS Mincho"/>
+          <w:b w:val="0"/>
+          <w:sz w:val="21"/>
+          <w:u w:val="none"/>
+        </w:rPr>
+        <w:t>これに違反することが判明した場合、甲は即時に本契約を解除できる。</w:t>
+      </w:r>
+    </w:p>
+    <w:p>
+      <w:pPr>
+        <w:spacing w:before="120" w:after="40"/>
+      </w:pPr>
+      <w:r>
+        <w:rPr>
+          <w:rFonts w:ascii="MS Mincho" w:hAnsi="MS Mincho" w:eastAsia="MS Mincho"/>
+          <w:b/>
+          <w:sz w:val="21"/>
+          <w:u w:val="none"/>
+        </w:rPr>
+        <w:t>第14条　（合 意 管 轄）</w:t>
+      </w:r>
+    </w:p>
+    <w:p>
+      <w:pPr>
+        <w:spacing w:before="0" w:after="20" w:line="340" w:lineRule="exact"/>
+        <w:ind w:left="397"/>
+      </w:pPr>
+      <w:r>
+        <w:rPr>
+          <w:rFonts w:ascii="MS Mincho" w:hAnsi="MS Mincho" w:eastAsia="MS Mincho"/>
+          <w:b w:val="0"/>
+          <w:sz w:val="21"/>
+          <w:u w:val="none"/>
+        </w:rPr>
+        <w:t>本契約に関する一切の紛争は、甲の本店所在地を管轄する裁判所を第一審の専属的合意管轄裁判所とする。</w:t>
+      </w:r>
+    </w:p>
+    <w:p>
+      <w:pPr>
+        <w:spacing w:before="120" w:after="40"/>
+      </w:pPr>
+      <w:r>
+        <w:rPr>
+          <w:rFonts w:ascii="MS Mincho" w:hAnsi="MS Mincho" w:eastAsia="MS Mincho"/>
+          <w:b/>
+          <w:sz w:val="21"/>
+          <w:u w:val="none"/>
+        </w:rPr>
+        <w:t>第15条　（そ の 他）</w:t>
+      </w:r>
+    </w:p>
+    <w:p>
+      <w:pPr>
+        <w:spacing w:before="0" w:after="20" w:line="340" w:lineRule="exact"/>
+        <w:ind w:left="397"/>
+      </w:pPr>
+      <w:r>
+        <w:rPr>
+          <w:rFonts w:ascii="MS Mincho" w:hAnsi="MS Mincho" w:eastAsia="MS Mincho"/>
+          <w:b w:val="0"/>
+          <w:sz w:val="21"/>
+          <w:u w:val="none"/>
+        </w:rPr>
+        <w:t>本契約に定めのない事項は、甲乙協議のうえ誠実に解決する。</w:t>
+      </w:r>
+    </w:p>
+    <w:p>
+      <w:pPr>
+        <w:spacing w:before="0" w:after="20" w:line="340" w:lineRule="exact"/>
+        <w:ind w:left="397"/>
+      </w:pPr>
+      <w:r>
+        <w:rPr>
+          <w:rFonts w:ascii="MS Mincho" w:hAnsi="MS Mincho" w:eastAsia="MS Mincho"/>
+          <w:b w:val="0"/>
+          <w:sz w:val="21"/>
+          <w:u w:val="none"/>
+        </w:rPr>
+        <w:t>本契約は、別途定める「社員寮管理規程」と一体をなし、乙はこれを遵守するものとする。</w:t>
+      </w:r>
+    </w:p>
+    <w:p/>
+    <w:p>
+      <w:pPr>
+        <w:spacing w:before="160" w:after="160"/>
+      </w:pPr>
+      <w:r>
+        <w:rPr>
+          <w:rFonts w:ascii="MS Mincho" w:hAnsi="MS Mincho" w:eastAsia="MS Mincho"/>
+          <w:b w:val="0"/>
+          <w:sz w:val="21"/>
+          <w:u w:val="none"/>
+        </w:rPr>
+        <w:t xml:space="preserve">　以上の契約を証するため、本書２通を作成し、甲乙それぞれ１通を保有する。</w:t>
+      </w:r>
+    </w:p>
+    <w:p>
+      <w:pPr>
+        <w:spacing w:before="0" w:after="240"/>
+        <w:jc w:val="right"/>
+      </w:pPr>
+      <w:r>
+        <w:rPr>
+          <w:rFonts w:ascii="MS Mincho" w:hAnsi="MS Mincho" w:eastAsia="MS Mincho"/>
+          <w:b w:val="0"/>
+          <w:sz w:val="21"/>
+          <w:u w:val="none"/>
+        </w:rPr>
+        <w:t>締結日　　　　年　　月　　日</w:t>
       </w:r>
     </w:p>
     <w:tbl>
@@ -47,39 +1421,77 @@
         <w:tblLook w:firstColumn="1" w:firstRow="1" w:lastColumn="0" w:lastRow="0" w:noHBand="0" w:noVBand="1" w:val="04A0"/>
       </w:tblPr>
       <w:tblGrid>
-        <w:gridCol w:w="4419"/>
-        <w:gridCol w:w="4419"/>
+        <w:gridCol w:w="4252"/>
+        <w:gridCol w:w="4252"/>
       </w:tblGrid>
       <w:tr>
         <w:tc>
           <w:tcPr>
-            <w:tcW w:type="dxa" w:w="4419"/>
+            <w:tcW w:type="dxa" w:w="1984"/>
           </w:tcPr>
           <w:p>
+            <w:pPr>
+              <w:spacing w:before="80" w:after="80"/>
+              <w:jc w:val="center"/>
+            </w:pPr>
             <w:r>
               <w:rPr>
-                <w:rFonts w:eastAsia="MS明朝"/>
-                <w:rFonts w:ascii="MS明朝" w:hAnsi="MS明朝"/>
-                <w:b w:val="0"/>
-                <w:sz w:val="20"/>
+                <w:rFonts w:ascii="MS Mincho" w:hAnsi="MS Mincho" w:eastAsia="MS Mincho"/>
+                <w:b/>
+                <w:sz w:val="21"/>
+                <w:u w:val="none"/>
               </w:rPr>
-              <w:t>物件所在地</w:t>
+              <w:t>甲（会　社）</w:t>
             </w:r>
           </w:p>
         </w:tc>
         <w:tc>
           <w:tcPr>
-            <w:tcW w:type="dxa" w:w="4419"/>
+            <w:tcW w:type="dxa" w:w="6520"/>
           </w:tcPr>
           <w:p>
+            <w:pPr>
+              <w:spacing w:before="60" w:after="60"/>
+              <w:ind w:left="170"/>
+            </w:pPr>
             <w:r>
               <w:rPr>
-                <w:rFonts w:eastAsia="MS明朝"/>
-                <w:rFonts w:ascii="MS明朝" w:hAnsi="MS明朝"/>
+                <w:rFonts w:ascii="MS Mincho" w:hAnsi="MS Mincho" w:eastAsia="MS Mincho"/>
                 <w:b w:val="0"/>
-                <w:sz w:val="20"/>
+                <w:sz w:val="21"/>
+                <w:u w:val="none"/>
               </w:rPr>
-              <w:t xml:space="preserve">　　　　　　　　　　　　　　　　　　　　　　　　　　　</w:t>
+              <w:t xml:space="preserve">会社名：株式会社　　　　　　　　　　</w:t>
+            </w:r>
+          </w:p>
+          <w:p>
+            <w:pPr>
+              <w:spacing w:before="60" w:after="60"/>
+              <w:ind w:left="170"/>
+            </w:pPr>
+            <w:r>
+              <w:rPr>
+                <w:rFonts w:ascii="MS Mincho" w:hAnsi="MS Mincho" w:eastAsia="MS Mincho"/>
+                <w:b w:val="0"/>
+                <w:sz w:val="21"/>
+                <w:u w:val="none"/>
+              </w:rPr>
+              <w:t>所在地：</w:t>
+            </w:r>
+          </w:p>
+          <w:p>
+            <w:pPr>
+              <w:spacing w:before="60" w:after="60"/>
+              <w:ind w:left="170"/>
+            </w:pPr>
+            <w:r>
+              <w:rPr>
+                <w:rFonts w:ascii="MS Mincho" w:hAnsi="MS Mincho" w:eastAsia="MS Mincho"/>
+                <w:b w:val="0"/>
+                <w:sz w:val="21"/>
+                <w:u w:val="none"/>
+              </w:rPr>
+              <w:t>代表者：　　　　　　　　　　　　　　　　　　　㊞</w:t>
             </w:r>
           </w:p>
         </w:tc>
@@ -87,33 +1499,71 @@
       <w:tr>
         <w:tc>
           <w:tcPr>
-            <w:tcW w:type="dxa" w:w="4419"/>
+            <w:tcW w:type="dxa" w:w="1984"/>
           </w:tcPr>
           <w:p>
+            <w:pPr>
+              <w:spacing w:before="80" w:after="80"/>
+              <w:jc w:val="center"/>
+            </w:pPr>
             <w:r>
               <w:rPr>
-                <w:rFonts w:eastAsia="MS明朝"/>
-                <w:rFonts w:ascii="MS明朝" w:hAnsi="MS明朝"/>
-                <w:b w:val="0"/>
-                <w:sz w:val="20"/>
+                <w:rFonts w:ascii="MS Mincho" w:hAnsi="MS Mincho" w:eastAsia="MS Mincho"/>
+                <w:b/>
+                <w:sz w:val="21"/>
+                <w:u w:val="none"/>
               </w:rPr>
-              <w:t>部屋番号</w:t>
+              <w:t>乙（入 居 者）</w:t>
             </w:r>
           </w:p>
         </w:tc>
         <w:tc>
           <w:tcPr>
-            <w:tcW w:type="dxa" w:w="4419"/>
+            <w:tcW w:type="dxa" w:w="6520"/>
           </w:tcPr>
           <w:p>
+            <w:pPr>
+              <w:spacing w:before="60" w:after="60"/>
+              <w:ind w:left="170"/>
+            </w:pPr>
             <w:r>
               <w:rPr>
-                <w:rFonts w:eastAsia="MS明朝"/>
-                <w:rFonts w:ascii="MS明朝" w:hAnsi="MS明朝"/>
+                <w:rFonts w:ascii="MS Mincho" w:hAnsi="MS Mincho" w:eastAsia="MS Mincho"/>
                 <w:b w:val="0"/>
-                <w:sz w:val="20"/>
+                <w:sz w:val="21"/>
+                <w:u w:val="none"/>
               </w:rPr>
-              <w:t xml:space="preserve">　　号室</w:t>
+              <w:t>住　所：</w:t>
+            </w:r>
+          </w:p>
+          <w:p>
+            <w:pPr>
+              <w:spacing w:before="60" w:after="60"/>
+              <w:ind w:left="170"/>
+            </w:pPr>
+            <w:r>
+              <w:rPr>
+                <w:rFonts w:ascii="MS Mincho" w:hAnsi="MS Mincho" w:eastAsia="MS Mincho"/>
+                <w:b w:val="0"/>
+                <w:sz w:val="21"/>
+                <w:u w:val="none"/>
+              </w:rPr>
+              <w:t>氏　名：　　　　　　　　　　　　　　　　　　　㊞</w:t>
+            </w:r>
+          </w:p>
+          <w:p>
+            <w:pPr>
+              <w:spacing w:before="60" w:after="60"/>
+              <w:ind w:left="170"/>
+            </w:pPr>
+            <w:r>
+              <w:rPr>
+                <w:rFonts w:ascii="MS Mincho" w:hAnsi="MS Mincho" w:eastAsia="MS Mincho"/>
+                <w:b w:val="0"/>
+                <w:sz w:val="21"/>
+                <w:u w:val="none"/>
+              </w:rPr>
+              <w:t>生年月日：　　　年　　月　　日</w:t>
             </w:r>
           </w:p>
         </w:tc>
@@ -121,1101 +1571,79 @@
       <w:tr>
         <w:tc>
           <w:tcPr>
-            <w:tcW w:type="dxa" w:w="4419"/>
+            <w:tcW w:type="dxa" w:w="1984"/>
           </w:tcPr>
           <w:p>
+            <w:pPr>
+              <w:spacing w:before="80" w:after="80"/>
+              <w:jc w:val="center"/>
+            </w:pPr>
             <w:r>
               <w:rPr>
-                <w:rFonts w:eastAsia="MS明朝"/>
-                <w:rFonts w:ascii="MS明朝" w:hAnsi="MS明朝"/>
-                <w:b w:val="0"/>
-                <w:sz w:val="20"/>
+                <w:rFonts w:ascii="MS Mincho" w:hAnsi="MS Mincho" w:eastAsia="MS Mincho"/>
+                <w:b/>
+                <w:sz w:val="21"/>
+                <w:u w:val="none"/>
               </w:rPr>
-              <w:t>間取り</w:t>
+              <w:t>連 帯 保 証 人</w:t>
             </w:r>
           </w:p>
         </w:tc>
         <w:tc>
           <w:tcPr>
-            <w:tcW w:type="dxa" w:w="4419"/>
+            <w:tcW w:type="dxa" w:w="6520"/>
           </w:tcPr>
           <w:p>
+            <w:pPr>
+              <w:spacing w:before="60" w:after="60"/>
+              <w:ind w:left="170"/>
+            </w:pPr>
             <w:r>
               <w:rPr>
-                <w:rFonts w:eastAsia="MS明朝"/>
-                <w:rFonts w:ascii="MS明朝" w:hAnsi="MS明朝"/>
+                <w:rFonts w:ascii="MS Mincho" w:hAnsi="MS Mincho" w:eastAsia="MS Mincho"/>
                 <w:b w:val="0"/>
-                <w:sz w:val="20"/>
+                <w:sz w:val="21"/>
+                <w:u w:val="none"/>
               </w:rPr>
-              <w:t xml:space="preserve">　　　</w:t>
+              <w:t>住　所：</w:t>
             </w:r>
           </w:p>
-        </w:tc>
-      </w:tr>
-      <w:tr>
-        <w:tc>
-          <w:tcPr>
-            <w:tcW w:type="dxa" w:w="4419"/>
-          </w:tcPr>
           <w:p>
+            <w:pPr>
+              <w:spacing w:before="60" w:after="60"/>
+              <w:ind w:left="170"/>
+            </w:pPr>
             <w:r>
               <w:rPr>
-                <w:rFonts w:eastAsia="MS明朝"/>
-                <w:rFonts w:ascii="MS明朝" w:hAnsi="MS明朝"/>
+                <w:rFonts w:ascii="MS Mincho" w:hAnsi="MS Mincho" w:eastAsia="MS Mincho"/>
                 <w:b w:val="0"/>
-                <w:sz w:val="20"/>
+                <w:sz w:val="21"/>
+                <w:u w:val="none"/>
               </w:rPr>
-              <w:t>専有面積</w:t>
+              <w:t>氏　名：　　　　　　　　　　　　　　　　　　　㊞</w:t>
             </w:r>
           </w:p>
-        </w:tc>
-        <w:tc>
-          <w:tcPr>
-            <w:tcW w:type="dxa" w:w="4419"/>
-          </w:tcPr>
           <w:p>
+            <w:pPr>
+              <w:spacing w:before="60" w:after="60"/>
+              <w:ind w:left="170"/>
+            </w:pPr>
             <w:r>
               <w:rPr>
-                <w:rFonts w:eastAsia="MS明朝"/>
-                <w:rFonts w:ascii="MS明朝" w:hAnsi="MS明朝"/>
+                <w:rFonts w:ascii="MS Mincho" w:hAnsi="MS Mincho" w:eastAsia="MS Mincho"/>
                 <w:b w:val="0"/>
-                <w:sz w:val="20"/>
+                <w:sz w:val="21"/>
+                <w:u w:val="none"/>
               </w:rPr>
-              <w:t xml:space="preserve">　　　㎡</w:t>
-            </w:r>
-          </w:p>
-        </w:tc>
-      </w:tr>
-      <w:tr>
-        <w:tc>
-          <w:tcPr>
-            <w:tcW w:type="dxa" w:w="4419"/>
-          </w:tcPr>
-          <w:p>
-            <w:r>
-              <w:rPr>
-                <w:rFonts w:eastAsia="MS明朝"/>
-                <w:rFonts w:ascii="MS明朝" w:hAnsi="MS明朝"/>
-                <w:b w:val="0"/>
-                <w:sz w:val="20"/>
-              </w:rPr>
-              <w:t>賃貸人（物件オーナー）</w:t>
-            </w:r>
-          </w:p>
-        </w:tc>
-        <w:tc>
-          <w:tcPr>
-            <w:tcW w:type="dxa" w:w="4419"/>
-          </w:tcPr>
-          <w:p>
-            <w:r>
-              <w:rPr>
-                <w:rFonts w:eastAsia="MS明朝"/>
-                <w:rFonts w:ascii="MS明朝" w:hAnsi="MS明朝"/>
-                <w:b w:val="0"/>
-                <w:sz w:val="20"/>
-              </w:rPr>
-              <w:t xml:space="preserve">　　　　　　　　　　　　　　</w:t>
-            </w:r>
-          </w:p>
-        </w:tc>
-      </w:tr>
-      <w:tr>
-        <w:tc>
-          <w:tcPr>
-            <w:tcW w:type="dxa" w:w="4419"/>
-          </w:tcPr>
-          <w:p>
-            <w:r>
-              <w:rPr>
-                <w:rFonts w:eastAsia="MS明朝"/>
-                <w:rFonts w:ascii="MS明朝" w:hAnsi="MS明朝"/>
-                <w:b w:val="0"/>
-                <w:sz w:val="20"/>
-              </w:rPr>
-              <w:t>甲（会社）が支払う月額賃料</w:t>
-            </w:r>
-          </w:p>
-        </w:tc>
-        <w:tc>
-          <w:tcPr>
-            <w:tcW w:type="dxa" w:w="4419"/>
-          </w:tcPr>
-          <w:p>
-            <w:r>
-              <w:rPr>
-                <w:rFonts w:eastAsia="MS明朝"/>
-                <w:rFonts w:ascii="MS明朝" w:hAnsi="MS明朝"/>
-                <w:b w:val="0"/>
-                <w:sz w:val="20"/>
-              </w:rPr>
-              <w:t>金　　　　　　円（税込）</w:t>
+              <w:t xml:space="preserve">乙との関係：　　　　　　　　　　　</w:t>
             </w:r>
           </w:p>
         </w:tc>
       </w:tr>
     </w:tbl>
-    <w:p/>
-    <w:p>
-      <w:r>
-        <w:rPr>
-          <w:rFonts w:eastAsia="MS明朝"/>
-          <w:rFonts w:ascii="MS明朝" w:hAnsi="MS明朝"/>
-          <w:b/>
-          <w:sz w:val="21"/>
-        </w:rPr>
-        <w:t>第1条（目的）</w:t>
-      </w:r>
-    </w:p>
-    <w:p>
-      <w:r>
-        <w:rPr>
-          <w:rFonts w:eastAsia="MS明朝"/>
-          <w:rFonts w:ascii="MS明朝" w:hAnsi="MS明朝"/>
-          <w:b w:val="0"/>
-          <w:sz w:val="21"/>
-        </w:rPr>
-        <w:t>甲は乙に対し、甲が賃借する下記寮の一室を入居施設として提供し、乙は本契約の定めに従いこれを使用する。</w:t>
-      </w:r>
-    </w:p>
-    <w:p>
-      <w:r>
-        <w:rPr>
-          <w:rFonts w:eastAsia="MS明朝"/>
-          <w:rFonts w:ascii="MS明朝" w:hAnsi="MS明朝"/>
-          <w:b w:val="0"/>
-          <w:sz w:val="21"/>
-        </w:rPr>
-        <w:t>乙は、寮を社員としての生活の場として使用するものとし、他の目的への転用を禁止する。</w:t>
-      </w:r>
-    </w:p>
-    <w:p/>
-    <w:p>
-      <w:r>
-        <w:rPr>
-          <w:rFonts w:eastAsia="MS明朝"/>
-          <w:rFonts w:ascii="MS明朝" w:hAnsi="MS明朝"/>
-          <w:b/>
-          <w:sz w:val="21"/>
-        </w:rPr>
-        <w:t>第2条（契約期間）</w:t>
-      </w:r>
-    </w:p>
-    <w:p>
-      <w:r>
-        <w:rPr>
-          <w:rFonts w:eastAsia="MS明朝"/>
-          <w:rFonts w:ascii="MS明朝" w:hAnsi="MS明朝"/>
-          <w:b w:val="0"/>
-          <w:sz w:val="21"/>
-        </w:rPr>
-        <w:t>本契約の期間は、入居日から　　　年　　月　　日までとする。</w:t>
-      </w:r>
-    </w:p>
-    <w:p>
-      <w:r>
-        <w:rPr>
-          <w:rFonts w:eastAsia="MS明朝"/>
-          <w:rFonts w:ascii="MS明朝" w:hAnsi="MS明朝"/>
-          <w:b w:val="0"/>
-          <w:sz w:val="21"/>
-        </w:rPr>
-        <w:t>ただし、乙が在職中である限り、同条件にて自動更新するものとする。</w:t>
-      </w:r>
-    </w:p>
-    <w:p>
-      <w:r>
-        <w:rPr>
-          <w:rFonts w:eastAsia="MS明朝"/>
-          <w:rFonts w:ascii="MS明朝" w:hAnsi="MS明朝"/>
-          <w:b w:val="0"/>
-          <w:sz w:val="21"/>
-        </w:rPr>
-        <w:t>乙または甲が更新を希望しない場合は、期間満了の60日前までに書面にて通知するものとする。</w:t>
-      </w:r>
-    </w:p>
-    <w:p>
-      <w:r>
-        <w:rPr>
-          <w:rFonts w:eastAsia="MS明朝"/>
-          <w:rFonts w:ascii="MS明朝" w:hAnsi="MS明朝"/>
-          <w:b w:val="0"/>
-          <w:sz w:val="21"/>
-        </w:rPr>
-        <w:t>乙が退職した場合は、退職日をもって本契約は終了し、退職日から30日以内に退去するものとする。</w:t>
-      </w:r>
-    </w:p>
-    <w:p/>
-    <w:p>
-      <w:r>
-        <w:rPr>
-          <w:rFonts w:eastAsia="MS明朝"/>
-          <w:rFonts w:ascii="MS明朝" w:hAnsi="MS明朝"/>
-          <w:b/>
-          <w:sz w:val="21"/>
-        </w:rPr>
-        <w:t>第2条の2（雇用との連動）</w:t>
-      </w:r>
-    </w:p>
-    <w:p>
-      <w:r>
-        <w:rPr>
-          <w:rFonts w:eastAsia="MS明朝"/>
-          <w:rFonts w:ascii="MS明朝" w:hAnsi="MS明朝"/>
-          <w:b w:val="0"/>
-          <w:sz w:val="21"/>
-        </w:rPr>
-        <w:t>本契約は、乙が甲の従業員であることを前提とする。</w:t>
-      </w:r>
-    </w:p>
-    <w:p>
-      <w:r>
-        <w:rPr>
-          <w:rFonts w:eastAsia="MS明朝"/>
-          <w:rFonts w:ascii="MS明朝" w:hAnsi="MS明朝"/>
-          <w:b w:val="0"/>
-          <w:sz w:val="21"/>
-        </w:rPr>
-        <w:t>乙が雇用契約を終了（退職・解雇を含む）した場合、本契約は当然に終了する。</w:t>
-      </w:r>
-    </w:p>
-    <w:p/>
-    <w:p>
-      <w:r>
-        <w:rPr>
-          <w:rFonts w:eastAsia="MS明朝"/>
-          <w:rFonts w:ascii="MS明朝" w:hAnsi="MS明朝"/>
-          <w:b/>
-          <w:sz w:val="21"/>
-        </w:rPr>
-        <w:t>第3条（寮費・支払方法）</w:t>
-      </w:r>
-    </w:p>
-    <w:p>
-      <w:r>
-        <w:rPr>
-          <w:rFonts w:eastAsia="MS明朝"/>
-          <w:rFonts w:ascii="MS明朝" w:hAnsi="MS明朝"/>
-          <w:b w:val="0"/>
-          <w:sz w:val="21"/>
-        </w:rPr>
-        <w:t>乙は甲に対し、以下の寮費を毎月支払うものとする。</w:t>
-      </w:r>
-    </w:p>
-    <w:p>
-      <w:r>
-        <w:rPr>
-          <w:rFonts w:eastAsia="MS明朝"/>
-          <w:rFonts w:ascii="MS明朝" w:hAnsi="MS明朝"/>
-          <w:b w:val="0"/>
-          <w:sz w:val="21"/>
-        </w:rPr>
-        <w:t xml:space="preserve">　・月額寮費：金　　　　　　円（甲が支払う月額賃料 ＋ 10,000円）</w:t>
-      </w:r>
-    </w:p>
-    <w:p>
-      <w:r>
-        <w:rPr>
-          <w:rFonts w:eastAsia="MS明朝"/>
-          <w:rFonts w:ascii="MS明朝" w:hAnsi="MS明朝"/>
-          <w:b w:val="0"/>
-          <w:sz w:val="21"/>
-        </w:rPr>
-        <w:t xml:space="preserve">　・支払期日：毎月　　日までに翌月分を支払う（または給与からの控除）</w:t>
-      </w:r>
-    </w:p>
-    <w:p>
-      <w:r>
-        <w:rPr>
-          <w:rFonts w:eastAsia="MS明朝"/>
-          <w:rFonts w:ascii="MS明朝" w:hAnsi="MS明朝"/>
-          <w:b w:val="0"/>
-          <w:sz w:val="21"/>
-        </w:rPr>
-        <w:t xml:space="preserve">　・支払方法：甲指定の銀行口座への振込、または給与からの天引き（乙の書面同意による）</w:t>
-      </w:r>
-    </w:p>
-    <w:p>
-      <w:r>
-        <w:rPr>
-          <w:rFonts w:eastAsia="MS明朝"/>
-          <w:rFonts w:ascii="MS明朝" w:hAnsi="MS明朝"/>
-          <w:b w:val="0"/>
-          <w:sz w:val="21"/>
-        </w:rPr>
-        <w:t>寮費の改定が必要な場合、甲は1ヶ月前に乙へ書面にて通知するものとする。</w:t>
-      </w:r>
-    </w:p>
-    <w:p/>
-    <w:p>
-      <w:r>
-        <w:rPr>
-          <w:rFonts w:eastAsia="MS明朝"/>
-          <w:rFonts w:ascii="MS明朝" w:hAnsi="MS明朝"/>
-          <w:b/>
-          <w:sz w:val="21"/>
-        </w:rPr>
-        <w:t>第4条（初期費用・敷金礼金の取扱い）</w:t>
-      </w:r>
-    </w:p>
-    <w:p>
-      <w:r>
-        <w:rPr>
-          <w:rFonts w:eastAsia="MS明朝"/>
-          <w:rFonts w:ascii="MS明朝" w:hAnsi="MS明朝"/>
-          <w:b w:val="0"/>
-          <w:sz w:val="21"/>
-        </w:rPr>
-        <w:t>甲は、物件オーナーとの賃貸借契約に基づき、以下の初期費用を負担する。</w:t>
-      </w:r>
-    </w:p>
-    <w:p>
-      <w:r>
-        <w:rPr>
-          <w:rFonts w:eastAsia="MS明朝"/>
-          <w:rFonts w:ascii="MS明朝" w:hAnsi="MS明朝"/>
-          <w:b w:val="0"/>
-          <w:sz w:val="21"/>
-        </w:rPr>
-        <w:t xml:space="preserve">　・敷金　：金　　　　　　円</w:t>
-      </w:r>
-    </w:p>
-    <w:p>
-      <w:r>
-        <w:rPr>
-          <w:rFonts w:eastAsia="MS明朝"/>
-          <w:rFonts w:ascii="MS明朝" w:hAnsi="MS明朝"/>
-          <w:b w:val="0"/>
-          <w:sz w:val="21"/>
-        </w:rPr>
-        <w:t xml:space="preserve">　・礼金　：金　　　　　　円</w:t>
-      </w:r>
-    </w:p>
-    <w:p>
-      <w:r>
-        <w:rPr>
-          <w:rFonts w:eastAsia="MS明朝"/>
-          <w:rFonts w:ascii="MS明朝" w:hAnsi="MS明朝"/>
-          <w:b w:val="0"/>
-          <w:sz w:val="21"/>
-        </w:rPr>
-        <w:t xml:space="preserve">　・その他初期費用（仲介手数料等）：金　　　　　　円</w:t>
-      </w:r>
-    </w:p>
-    <w:p>
-      <w:r>
-        <w:rPr>
-          <w:rFonts w:eastAsia="MS明朝"/>
-          <w:rFonts w:ascii="MS明朝" w:hAnsi="MS明朝"/>
-          <w:b w:val="0"/>
-          <w:sz w:val="21"/>
-        </w:rPr>
-        <w:t>前項の敷金については、乙が退去する際に物件から返還される場合、甲に帰属する。ただし、乙の故意または過失による損傷等に起因する原状回復費用がある場合は、乙が負担するものとする。</w:t>
-      </w:r>
-    </w:p>
-    <w:p>
-      <w:r>
-        <w:rPr>
-          <w:rFonts w:eastAsia="MS明朝"/>
-          <w:rFonts w:ascii="MS明朝" w:hAnsi="MS明朝"/>
-          <w:b w:val="0"/>
-          <w:sz w:val="21"/>
-        </w:rPr>
-        <w:t>礼金およびその他初期費用は甲の負担とするが、乙は第5条に定める初期費用分担金を甲に支払うことでその一部を負担するものとする。</w:t>
-      </w:r>
-    </w:p>
-    <w:p/>
-    <w:p>
-      <w:r>
-        <w:rPr>
-          <w:rFonts w:eastAsia="MS明朝"/>
-          <w:rFonts w:ascii="MS明朝" w:hAnsi="MS明朝"/>
-          <w:b/>
-          <w:sz w:val="21"/>
-        </w:rPr>
-        <w:t>第5条（初期費用分担金・早期退去時の精算）</w:t>
-      </w:r>
-    </w:p>
-    <w:p>
-      <w:r>
-        <w:rPr>
-          <w:rFonts w:eastAsia="MS明朝"/>
-          <w:rFonts w:ascii="MS明朝" w:hAnsi="MS明朝"/>
-          <w:b w:val="0"/>
-          <w:sz w:val="21"/>
-        </w:rPr>
-        <w:t>乙は、入居に際して甲が負担した初期費用（礼金・仲介手数料等）を分担するため、月額寮費に含まれる月額10,000円を、在籍期間中、甲に支払い続けるものとする。</w:t>
-      </w:r>
-    </w:p>
-    <w:p>
-      <w:r>
-        <w:rPr>
-          <w:rFonts w:eastAsia="MS明朝"/>
-          <w:rFonts w:ascii="MS明朝" w:hAnsi="MS明朝"/>
-          <w:b w:val="0"/>
-          <w:sz w:val="21"/>
-        </w:rPr>
-        <w:t>乙が入居日から　　　ヶ月以内に退去した場合、乙は甲に対し、以下の計算式による未回収初期費用相当額を一括で支払うものとする。</w:t>
-      </w:r>
-    </w:p>
-    <w:p>
-      <w:r>
-        <w:rPr>
-          <w:rFonts w:eastAsia="MS明朝"/>
-          <w:rFonts w:ascii="MS明朝" w:hAnsi="MS明朝"/>
-          <w:b w:val="0"/>
-          <w:sz w:val="21"/>
-        </w:rPr>
-        <w:t xml:space="preserve">　　未回収額 ＝ 甲負担初期費用総額 － （実際の在籍月数 × 10,000円）</w:t>
-      </w:r>
-    </w:p>
-    <w:p>
-      <w:r>
-        <w:rPr>
-          <w:rFonts w:eastAsia="MS明朝"/>
-          <w:rFonts w:ascii="MS明朝" w:hAnsi="MS明朝"/>
-          <w:b w:val="0"/>
-          <w:sz w:val="21"/>
-        </w:rPr>
-        <w:t>前項の支払いは、退去確定後　　日以内に行うものとする。</w:t>
-      </w:r>
-    </w:p>
-    <w:p>
-      <w:r>
-        <w:rPr>
-          <w:rFonts w:eastAsia="MS明朝"/>
-          <w:rFonts w:ascii="MS明朝" w:hAnsi="MS明朝"/>
-          <w:b w:val="0"/>
-          <w:sz w:val="21"/>
-        </w:rPr>
-        <w:t>乙が退職する場合において、未払いの未回収額が生じているときは、甲は乙の退職時における最終給与・退職金等と相殺することができる。ただし、最低賃金を下回ることとなる控除は行わない。</w:t>
-      </w:r>
-    </w:p>
-    <w:p/>
-    <w:p>
-      <w:r>
-        <w:rPr>
-          <w:rFonts w:eastAsia="MS明朝"/>
-          <w:rFonts w:ascii="MS明朝" w:hAnsi="MS明朝"/>
-          <w:b/>
-          <w:sz w:val="21"/>
-        </w:rPr>
-        <w:t>第6条（敷金の回収リスクと負担）</w:t>
-      </w:r>
-    </w:p>
-    <w:p>
-      <w:r>
-        <w:rPr>
-          <w:rFonts w:eastAsia="MS明朝"/>
-          <w:rFonts w:ascii="MS明朝" w:hAnsi="MS明朝"/>
-          <w:b w:val="0"/>
-          <w:sz w:val="21"/>
-        </w:rPr>
-        <w:t>乙の行為（故意・過失・禁止行為を含む）により甲が物件オーナーから敷金の一部または全部の返還を受けられなかった場合、その損害は乙が負担するものとする。</w:t>
-      </w:r>
-    </w:p>
-    <w:p>
-      <w:r>
-        <w:rPr>
-          <w:rFonts w:eastAsia="MS明朝"/>
-          <w:rFonts w:ascii="MS明朝" w:hAnsi="MS明朝"/>
-          <w:b w:val="0"/>
-          <w:sz w:val="21"/>
-        </w:rPr>
-        <w:t>原状回復費用が敷金を超過した場合の超過分についても、乙の故意・過失によるものは乙が負担する。</w:t>
-      </w:r>
-    </w:p>
-    <w:p/>
-    <w:p>
-      <w:r>
-        <w:rPr>
-          <w:rFonts w:eastAsia="MS明朝"/>
-          <w:rFonts w:ascii="MS明朝" w:hAnsi="MS明朝"/>
-          <w:b/>
-          <w:sz w:val="21"/>
-        </w:rPr>
-        <w:t>第7条（連帯保証人）</w:t>
-      </w:r>
-    </w:p>
-    <w:p>
-      <w:r>
-        <w:rPr>
-          <w:rFonts w:eastAsia="MS明朝"/>
-          <w:rFonts w:ascii="MS明朝" w:hAnsi="MS明朝"/>
-          <w:b w:val="0"/>
-          <w:sz w:val="21"/>
-        </w:rPr>
-        <w:t>乙は連帯保証人1名を立てるものとする。</w:t>
-      </w:r>
-    </w:p>
-    <w:p>
-      <w:r>
-        <w:rPr>
-          <w:rFonts w:eastAsia="MS明朝"/>
-          <w:rFonts w:ascii="MS明朝" w:hAnsi="MS明朝"/>
-          <w:b w:val="0"/>
-          <w:sz w:val="21"/>
-        </w:rPr>
-        <w:t>連帯保証人は、乙と連帯して本契約から生じる一切の債務を負うものとする。</w:t>
-      </w:r>
-    </w:p>
-    <w:p/>
-    <w:p>
-      <w:r>
-        <w:rPr>
-          <w:rFonts w:eastAsia="MS明朝"/>
-          <w:rFonts w:ascii="MS明朝" w:hAnsi="MS明朝"/>
-          <w:b/>
-          <w:sz w:val="21"/>
-        </w:rPr>
-        <w:t>第8条（施設の使用・管理）</w:t>
-      </w:r>
-    </w:p>
-    <w:p>
-      <w:r>
-        <w:rPr>
-          <w:rFonts w:eastAsia="MS明朝"/>
-          <w:rFonts w:ascii="MS明朝" w:hAnsi="MS明朝"/>
-          <w:b w:val="0"/>
-          <w:sz w:val="21"/>
-        </w:rPr>
-        <w:t>乙は、善良なる管理者の注意をもって寮を使用し、清潔かつ整然と維持管理しなければならない。</w:t>
-      </w:r>
-    </w:p>
-    <w:p>
-      <w:r>
-        <w:rPr>
-          <w:rFonts w:eastAsia="MS明朝"/>
-          <w:rFonts w:ascii="MS明朝" w:hAnsi="MS明朝"/>
-          <w:b w:val="0"/>
-          <w:sz w:val="21"/>
-        </w:rPr>
-        <w:t>乙は、以下の行為を禁止する。</w:t>
-      </w:r>
-    </w:p>
-    <w:p>
-      <w:r>
-        <w:rPr>
-          <w:rFonts w:eastAsia="MS明朝"/>
-          <w:rFonts w:ascii="MS明朝" w:hAnsi="MS明朝"/>
-          <w:b w:val="0"/>
-          <w:sz w:val="21"/>
-        </w:rPr>
-        <w:t xml:space="preserve">　（1）無断での第三者の宿泊・同居</w:t>
-      </w:r>
-    </w:p>
-    <w:p>
-      <w:r>
-        <w:rPr>
-          <w:rFonts w:eastAsia="MS明朝"/>
-          <w:rFonts w:ascii="MS明朝" w:hAnsi="MS明朝"/>
-          <w:b w:val="0"/>
-          <w:sz w:val="21"/>
-        </w:rPr>
-        <w:t xml:space="preserve">　（2）部屋の改造・模様替え（軽微なものを除く）</w:t>
-      </w:r>
-    </w:p>
-    <w:p>
-      <w:r>
-        <w:rPr>
-          <w:rFonts w:eastAsia="MS明朝"/>
-          <w:rFonts w:ascii="MS明朝" w:hAnsi="MS明朝"/>
-          <w:b w:val="0"/>
-          <w:sz w:val="21"/>
-        </w:rPr>
-        <w:t xml:space="preserve">　（3）危険物・ペットの持込</w:t>
-      </w:r>
-    </w:p>
-    <w:p>
-      <w:r>
-        <w:rPr>
-          <w:rFonts w:eastAsia="MS明朝"/>
-          <w:rFonts w:ascii="MS明朝" w:hAnsi="MS明朝"/>
-          <w:b w:val="0"/>
-          <w:sz w:val="21"/>
-        </w:rPr>
-        <w:t xml:space="preserve">　（4）近隣への迷惑行為（騒音・臭気等）</w:t>
-      </w:r>
-    </w:p>
-    <w:p>
-      <w:r>
-        <w:rPr>
-          <w:rFonts w:eastAsia="MS明朝"/>
-          <w:rFonts w:ascii="MS明朝" w:hAnsi="MS明朝"/>
-          <w:b w:val="0"/>
-          <w:sz w:val="21"/>
-        </w:rPr>
-        <w:t xml:space="preserve">　（5）寮を業務・商業目的に使用すること</w:t>
-      </w:r>
-    </w:p>
-    <w:p>
-      <w:r>
-        <w:rPr>
-          <w:rFonts w:eastAsia="MS明朝"/>
-          <w:rFonts w:ascii="MS明朝" w:hAnsi="MS明朝"/>
-          <w:b w:val="0"/>
-          <w:sz w:val="21"/>
-        </w:rPr>
-        <w:t xml:space="preserve">　（6）その他管理規程に違反する行為</w:t>
-      </w:r>
-    </w:p>
-    <w:p/>
-    <w:p>
-      <w:r>
-        <w:rPr>
-          <w:rFonts w:eastAsia="MS明朝"/>
-          <w:rFonts w:ascii="MS明朝" w:hAnsi="MS明朝"/>
-          <w:b/>
-          <w:sz w:val="21"/>
-        </w:rPr>
-        <w:t>第9条（退去・原状回復）</w:t>
-      </w:r>
-    </w:p>
-    <w:p>
-      <w:r>
-        <w:rPr>
-          <w:rFonts w:eastAsia="MS明朝"/>
-          <w:rFonts w:ascii="MS明朝" w:hAnsi="MS明朝"/>
-          <w:b w:val="0"/>
-          <w:sz w:val="21"/>
-        </w:rPr>
-        <w:t>乙は退去時に、善良な管理者の注意義務違反により損傷した箇所を原状回復するものとする。</w:t>
-      </w:r>
-    </w:p>
-    <w:p>
-      <w:r>
-        <w:rPr>
-          <w:rFonts w:eastAsia="MS明朝"/>
-          <w:rFonts w:ascii="MS明朝" w:hAnsi="MS明朝"/>
-          <w:b w:val="0"/>
-          <w:sz w:val="21"/>
-        </w:rPr>
-        <w:t>乙は退去日の30日前までに甲へ書面にて通知しなければならない。</w:t>
-      </w:r>
-    </w:p>
-    <w:p>
-      <w:r>
-        <w:rPr>
-          <w:rFonts w:eastAsia="MS明朝"/>
-          <w:rFonts w:ascii="MS明朝" w:hAnsi="MS明朝"/>
-          <w:b w:val="0"/>
-          <w:sz w:val="21"/>
-        </w:rPr>
-        <w:t>甲は退去後、速やかに物件の状況を確認し、乙の負担すべき原状回復費用を通知する。</w:t>
-      </w:r>
-    </w:p>
-    <w:p/>
-    <w:p>
-      <w:r>
-        <w:rPr>
-          <w:rFonts w:eastAsia="MS明朝"/>
-          <w:rFonts w:ascii="MS明朝" w:hAnsi="MS明朝"/>
-          <w:b/>
-          <w:sz w:val="21"/>
-        </w:rPr>
-        <w:t>第10条（支払遅延）</w:t>
-      </w:r>
-    </w:p>
-    <w:p>
-      <w:r>
-        <w:rPr>
-          <w:rFonts w:eastAsia="MS明朝"/>
-          <w:rFonts w:ascii="MS明朝" w:hAnsi="MS明朝"/>
-          <w:b w:val="0"/>
-          <w:sz w:val="21"/>
-        </w:rPr>
-        <w:t>寮費の支払いが期日を超過した場合、乙は年14.6%の割合による遅延損害金を甲に支払うものとする。</w:t>
-      </w:r>
-    </w:p>
-    <w:p>
-      <w:r>
-        <w:rPr>
-          <w:rFonts w:eastAsia="MS明朝"/>
-          <w:rFonts w:ascii="MS明朝" w:hAnsi="MS明朝"/>
-          <w:b w:val="0"/>
-          <w:sz w:val="21"/>
-        </w:rPr>
-        <w:t>支払いが7日以上遅延した場合、甲は入居を制限できるものとする。</w:t>
-      </w:r>
-    </w:p>
-    <w:p>
-      <w:r>
-        <w:rPr>
-          <w:rFonts w:eastAsia="MS明朝"/>
-          <w:rFonts w:ascii="MS明朝" w:hAnsi="MS明朝"/>
-          <w:b w:val="0"/>
-          <w:sz w:val="21"/>
-        </w:rPr>
-        <w:t>支払いが15日以上遅延した場合、甲は本契約を解除できるものとする。</w:t>
-      </w:r>
-    </w:p>
-    <w:p/>
-    <w:p>
-      <w:r>
-        <w:rPr>
-          <w:rFonts w:eastAsia="MS明朝"/>
-          <w:rFonts w:ascii="MS明朝" w:hAnsi="MS明朝"/>
-          <w:b/>
-          <w:sz w:val="21"/>
-        </w:rPr>
-        <w:t>第11条（即時解除）</w:t>
-      </w:r>
-    </w:p>
-    <w:p>
-      <w:r>
-        <w:rPr>
-          <w:rFonts w:eastAsia="MS明朝"/>
-          <w:rFonts w:ascii="MS明朝" w:hAnsi="MS明朝"/>
-          <w:b w:val="0"/>
-          <w:sz w:val="21"/>
-        </w:rPr>
-        <w:t>甲は、乙が以下のいずれかに該当する場合、催告なしに即時に本契約を解除できる。</w:t>
-      </w:r>
-    </w:p>
-    <w:p>
-      <w:r>
-        <w:rPr>
-          <w:rFonts w:eastAsia="MS明朝"/>
-          <w:rFonts w:ascii="MS明朝" w:hAnsi="MS明朝"/>
-          <w:b w:val="0"/>
-          <w:sz w:val="21"/>
-        </w:rPr>
-        <w:t xml:space="preserve">　（1）寮費の支払いを怠ったとき</w:t>
-      </w:r>
-    </w:p>
-    <w:p>
-      <w:r>
-        <w:rPr>
-          <w:rFonts w:eastAsia="MS明朝"/>
-          <w:rFonts w:ascii="MS明朝" w:hAnsi="MS明朝"/>
-          <w:b w:val="0"/>
-          <w:sz w:val="21"/>
-        </w:rPr>
-        <w:t xml:space="preserve">　（2）虚偽の申告をしたとき</w:t>
-      </w:r>
-    </w:p>
-    <w:p>
-      <w:r>
-        <w:rPr>
-          <w:rFonts w:eastAsia="MS明朝"/>
-          <w:rFonts w:ascii="MS明朝" w:hAnsi="MS明朝"/>
-          <w:b w:val="0"/>
-          <w:sz w:val="21"/>
-        </w:rPr>
-        <w:t xml:space="preserve">　（3）禁止事項に違反したとき</w:t>
-      </w:r>
-    </w:p>
-    <w:p>
-      <w:r>
-        <w:rPr>
-          <w:rFonts w:eastAsia="MS明朝"/>
-          <w:rFonts w:ascii="MS明朝" w:hAnsi="MS明朝"/>
-          <w:b w:val="0"/>
-          <w:sz w:val="21"/>
-        </w:rPr>
-        <w:t xml:space="preserve">　（4）甲を退職したとき（退職届提出・解雇通知を含む）</w:t>
-      </w:r>
-    </w:p>
-    <w:p>
-      <w:r>
-        <w:rPr>
-          <w:rFonts w:eastAsia="MS明朝"/>
-          <w:rFonts w:ascii="MS明朝" w:hAnsi="MS明朝"/>
-          <w:b w:val="0"/>
-          <w:sz w:val="21"/>
-        </w:rPr>
-        <w:t xml:space="preserve">　（5）反社会的勢力に関与したとき</w:t>
-      </w:r>
-    </w:p>
-    <w:p>
-      <w:r>
-        <w:rPr>
-          <w:rFonts w:eastAsia="MS明朝"/>
-          <w:rFonts w:ascii="MS明朝" w:hAnsi="MS明朝"/>
-          <w:b w:val="0"/>
-          <w:sz w:val="21"/>
-        </w:rPr>
-        <w:t xml:space="preserve">　（6）その他本契約の条項に重大な違反をしたとき</w:t>
-      </w:r>
-    </w:p>
-    <w:p/>
-    <w:p>
-      <w:r>
-        <w:rPr>
-          <w:rFonts w:eastAsia="MS明朝"/>
-          <w:rFonts w:ascii="MS明朝" w:hAnsi="MS明朝"/>
-          <w:b/>
-          <w:sz w:val="21"/>
-        </w:rPr>
-        <w:t>第12条（損害賠償）</w:t>
-      </w:r>
-    </w:p>
-    <w:p>
-      <w:r>
-        <w:rPr>
-          <w:rFonts w:eastAsia="MS明朝"/>
-          <w:rFonts w:ascii="MS明朝" w:hAnsi="MS明朝"/>
-          <w:b w:val="0"/>
-          <w:sz w:val="21"/>
-        </w:rPr>
-        <w:t>乙の故意または過失により甲または第三者に損害を与えた場合、乙はその損害を賠償するものとする。</w:t>
-      </w:r>
-    </w:p>
-    <w:p/>
-    <w:p>
-      <w:r>
-        <w:rPr>
-          <w:rFonts w:eastAsia="MS明朝"/>
-          <w:rFonts w:ascii="MS明朝" w:hAnsi="MS明朝"/>
-          <w:b/>
-          <w:sz w:val="21"/>
-        </w:rPr>
-        <w:t>第13条（反社会的勢力の排除）</w:t>
-      </w:r>
-    </w:p>
-    <w:p>
-      <w:r>
-        <w:rPr>
-          <w:rFonts w:eastAsia="MS明朝"/>
-          <w:rFonts w:ascii="MS明朝" w:hAnsi="MS明朝"/>
-          <w:b w:val="0"/>
-          <w:sz w:val="21"/>
-        </w:rPr>
-        <w:t>乙および連帯保証人は、反社会的勢力でないことを表明・保証する。</w:t>
-      </w:r>
-    </w:p>
-    <w:p>
-      <w:r>
-        <w:rPr>
-          <w:rFonts w:eastAsia="MS明朝"/>
-          <w:rFonts w:ascii="MS明朝" w:hAnsi="MS明朝"/>
-          <w:b w:val="0"/>
-          <w:sz w:val="21"/>
-        </w:rPr>
-        <w:t>上記に反することが判明した場合、甲は即時に本契約を解除できる。</w:t>
-      </w:r>
-    </w:p>
-    <w:p/>
-    <w:p>
-      <w:r>
-        <w:rPr>
-          <w:rFonts w:eastAsia="MS明朝"/>
-          <w:rFonts w:ascii="MS明朝" w:hAnsi="MS明朝"/>
-          <w:b/>
-          <w:sz w:val="21"/>
-        </w:rPr>
-        <w:t>第14条（合意管轄）</w:t>
-      </w:r>
-    </w:p>
-    <w:p>
-      <w:r>
-        <w:rPr>
-          <w:rFonts w:eastAsia="MS明朝"/>
-          <w:rFonts w:ascii="MS明朝" w:hAnsi="MS明朝"/>
-          <w:b w:val="0"/>
-          <w:sz w:val="21"/>
-        </w:rPr>
-        <w:t>本契約に関する紛争については、甲の本店所在地を管轄する裁判所を第一審の専属的合意管轄裁判所とする。</w:t>
-      </w:r>
-    </w:p>
-    <w:p/>
-    <w:p>
-      <w:r>
-        <w:rPr>
-          <w:rFonts w:eastAsia="MS明朝"/>
-          <w:rFonts w:ascii="MS明朝" w:hAnsi="MS明朝"/>
-          <w:b/>
-          <w:sz w:val="21"/>
-        </w:rPr>
-        <w:t>第15条（その他）</w:t>
-      </w:r>
-    </w:p>
-    <w:p>
-      <w:r>
-        <w:rPr>
-          <w:rFonts w:eastAsia="MS明朝"/>
-          <w:rFonts w:ascii="MS明朝" w:hAnsi="MS明朝"/>
-          <w:b w:val="0"/>
-          <w:sz w:val="21"/>
-        </w:rPr>
-        <w:t>本契約に定めのない事項については、甲乙協議の上、誠実に解決するものとする。</w:t>
-      </w:r>
-    </w:p>
-    <w:p>
-      <w:r>
-        <w:rPr>
-          <w:rFonts w:eastAsia="MS明朝"/>
-          <w:rFonts w:ascii="MS明朝" w:hAnsi="MS明朝"/>
-          <w:b w:val="0"/>
-          <w:sz w:val="21"/>
-        </w:rPr>
-        <w:t>本契約は、別途定める「社員寮管理規程」と一体をなすものとし、乙はこれを遵守するものとする。</w:t>
-      </w:r>
-    </w:p>
-    <w:p/>
-    <w:p/>
-    <w:p>
-      <w:r>
-        <w:rPr>
-          <w:rFonts w:eastAsia="MS明朝"/>
-          <w:rFonts w:ascii="MS明朝" w:hAnsi="MS明朝"/>
-          <w:b w:val="0"/>
-          <w:sz w:val="21"/>
-        </w:rPr>
-        <w:t>以上の契約を証するため、本書2通を作成し、甲乙各1通を保有する。</w:t>
-      </w:r>
-    </w:p>
-    <w:p/>
-    <w:p>
-      <w:r>
-        <w:rPr>
-          <w:rFonts w:eastAsia="MS明朝"/>
-          <w:rFonts w:ascii="MS明朝" w:hAnsi="MS明朝"/>
-          <w:b w:val="0"/>
-          <w:sz w:val="21"/>
-        </w:rPr>
-        <w:t xml:space="preserve">　　　　　契約締結日：　　　年　　月　　日</w:t>
-      </w:r>
-    </w:p>
-    <w:p/>
-    <w:p>
-      <w:r>
-        <w:rPr>
-          <w:rFonts w:eastAsia="MS明朝"/>
-          <w:rFonts w:ascii="MS明朝" w:hAnsi="MS明朝"/>
-          <w:b/>
-          <w:sz w:val="21"/>
-        </w:rPr>
-        <w:t>甲（会社）</w:t>
-      </w:r>
-    </w:p>
-    <w:p>
-      <w:r>
-        <w:rPr>
-          <w:rFonts w:eastAsia="MS明朝"/>
-          <w:rFonts w:ascii="MS明朝" w:hAnsi="MS明朝"/>
-          <w:b w:val="0"/>
-          <w:sz w:val="21"/>
-        </w:rPr>
-        <w:t xml:space="preserve">　　会社名：株式会社　　　　　　　　</w:t>
-      </w:r>
-    </w:p>
-    <w:p>
-      <w:r>
-        <w:rPr>
-          <w:rFonts w:eastAsia="MS明朝"/>
-          <w:rFonts w:ascii="MS明朝" w:hAnsi="MS明朝"/>
-          <w:b w:val="0"/>
-          <w:sz w:val="21"/>
-        </w:rPr>
-        <w:t xml:space="preserve">　　所在地：</w:t>
-      </w:r>
-    </w:p>
-    <w:p>
-      <w:r>
-        <w:rPr>
-          <w:rFonts w:eastAsia="MS明朝"/>
-          <w:rFonts w:ascii="MS明朝" w:hAnsi="MS明朝"/>
-          <w:b w:val="0"/>
-          <w:sz w:val="21"/>
-        </w:rPr>
-        <w:t xml:space="preserve">　　代表者：　　　　　　　　　　　　　　　　　㊞</w:t>
-      </w:r>
-    </w:p>
-    <w:p/>
-    <w:p>
-      <w:r>
-        <w:rPr>
-          <w:rFonts w:eastAsia="MS明朝"/>
-          <w:rFonts w:ascii="MS明朝" w:hAnsi="MS明朝"/>
-          <w:b/>
-          <w:sz w:val="21"/>
-        </w:rPr>
-        <w:t>乙（入居者）</w:t>
-      </w:r>
-    </w:p>
-    <w:p>
-      <w:r>
-        <w:rPr>
-          <w:rFonts w:eastAsia="MS明朝"/>
-          <w:rFonts w:ascii="MS明朝" w:hAnsi="MS明朝"/>
-          <w:b w:val="0"/>
-          <w:sz w:val="21"/>
-        </w:rPr>
-        <w:t xml:space="preserve">　　住　所：</w:t>
-      </w:r>
-    </w:p>
-    <w:p>
-      <w:r>
-        <w:rPr>
-          <w:rFonts w:eastAsia="MS明朝"/>
-          <w:rFonts w:ascii="MS明朝" w:hAnsi="MS明朝"/>
-          <w:b w:val="0"/>
-          <w:sz w:val="21"/>
-        </w:rPr>
-        <w:t xml:space="preserve">　　氏　名：　　　　　　　　　　　　　　　　　㊞</w:t>
-      </w:r>
-    </w:p>
-    <w:p>
-      <w:r>
-        <w:rPr>
-          <w:rFonts w:eastAsia="MS明朝"/>
-          <w:rFonts w:ascii="MS明朝" w:hAnsi="MS明朝"/>
-          <w:b w:val="0"/>
-          <w:sz w:val="21"/>
-        </w:rPr>
-        <w:t xml:space="preserve">　　生年月日：　　　年　　月　　日</w:t>
-      </w:r>
-    </w:p>
-    <w:p/>
-    <w:p>
-      <w:r>
-        <w:rPr>
-          <w:rFonts w:eastAsia="MS明朝"/>
-          <w:rFonts w:ascii="MS明朝" w:hAnsi="MS明朝"/>
-          <w:b/>
-          <w:sz w:val="21"/>
-        </w:rPr>
-        <w:t>連帯保証人</w:t>
-      </w:r>
-    </w:p>
-    <w:p>
-      <w:r>
-        <w:rPr>
-          <w:rFonts w:eastAsia="MS明朝"/>
-          <w:rFonts w:ascii="MS明朝" w:hAnsi="MS明朝"/>
-          <w:b w:val="0"/>
-          <w:sz w:val="21"/>
-        </w:rPr>
-        <w:t xml:space="preserve">　　住　所：</w:t>
-      </w:r>
-    </w:p>
-    <w:p>
-      <w:r>
-        <w:rPr>
-          <w:rFonts w:eastAsia="MS明朝"/>
-          <w:rFonts w:ascii="MS明朝" w:hAnsi="MS明朝"/>
-          <w:b w:val="0"/>
-          <w:sz w:val="21"/>
-        </w:rPr>
-        <w:t xml:space="preserve">　　氏　名：　　　　　　　　　　　　　　　　　㊞</w:t>
-      </w:r>
-    </w:p>
-    <w:p>
-      <w:r>
-        <w:rPr>
-          <w:rFonts w:eastAsia="MS明朝"/>
-          <w:rFonts w:ascii="MS明朝" w:hAnsi="MS明朝"/>
-          <w:b w:val="0"/>
-          <w:sz w:val="21"/>
-        </w:rPr>
-        <w:t xml:space="preserve">　　乙との関係：</w:t>
-      </w:r>
-    </w:p>
-    <w:p/>
     <w:sectPr>
-      <w:pgSz w:w="12240" w:h="15840"/>
-      <w:pgMar w:top="1417" w:right="1701" w:bottom="1417" w:left="1701" w:header="720" w:footer="720" w:gutter="0"/>
+      <w:pgSz w:w="11906" w:h="16838"/>
+      <w:pgMar w:top="1701" w:right="1701" w:bottom="1701" w:left="1701" w:header="720" w:footer="720" w:gutter="0"/>
       <w:cols w:space="720"/>
       <w:docGrid w:linePitch="360"/>
     </w:sectPr>

</xml_diff>